<commit_message>
Close the v1 record: REL-1 complete, CP-3B landed, twenty-three interview answers
progress.md records the full arc: CP-3B landed on owner direction without item 6
and why that is stated rather than smoothed; the independent re-verification of
the hard gate on days the Lead never tested; the schema firewall refusing the
Orchestrator's own input; REL-1's four conditions all met; the transient 429 a
cold first visitor can meet; and the decision-trail link architecture.

Interview answers 22 and 23 file the two questions this checkpoint earned: how
you prove a browser re-implementation is still the evaluated model, and how you
host an interactive demo for nothing that cannot fall asleep.

Co-Authored-By: Claude Opus 5 <noreply@anthropic.com>
</commit_message>
<xml_diff>
--- a/שאלות תשובות.docx
+++ b/שאלות תשובות.docx
@@ -2202,6 +2202,186 @@
           <w:rtl/>
         </w:rPr>
         <w:t xml:space="preserve">אז הפתרון הוא להריץ את המחברת האינטראקטיבית ב-WebAssembly בתוך הדפדפן על אירוח סטטי. חינם, ובלי שרת שיכול להירדם. והמלכודת האמיתית שם היא לא טכנית אלא טענתית: כל ארבעת המשטחים שלנו אומרים שהמודל שנשלח הוא בדיוק המודל שנבדק, והרצה בדפדפן היא מימוש מחדש. אז הבר של אותו שלב דורש הוכחת זהות מול הארטיפקט הקפוא על פיקסצ׳ר מחויב, עם בקרת חיוב שמשבשת סף אחד ודורשת שההשוואה תיכשל. אם אי אפשר להוכיח זהות, התשובה היא לחסום ולא להחליש את הטענה.</w:t>
+      </w:r>
+    </w:p>
+    <w:p>
+      <w:pPr>
+        <w:pBdr>
+          <w:bottom w:val="single" w:sz="6" w:space="1" w:color="C8C8C8"/>
+        </w:pBdr>
+        <w:bidi/>
+        <w:spacing w:after="240" w:before="80"/>
+      </w:pPr>
+    </w:p>
+    <w:p>
+      <w:pPr>
+        <w:pStyle w:val="Heading2"/>
+        <w:bidi/>
+        <w:spacing w:after="160" w:before="360"/>
+        <w:jc w:val="right"/>
+      </w:pPr>
+      <w:r>
+        <w:rPr>
+          <w:rFonts w:ascii="Arial" w:cs="Arial" w:eastAsia="Arial" w:hAnsi="Arial"/>
+          <w:color w:val="2A4B7C"/>
+          <w:sz w:val="26"/>
+          <w:szCs w:val="26"/>
+          <w:rtl/>
+        </w:rPr>
+        <w:t xml:space="preserve">22. המודל שלך רץ בדפדפן. איך אתה יודע שזה עדיין אותו מודל שנבדק?</w:t>
+      </w:r>
+    </w:p>
+    <w:p>
+      <w:pPr>
+        <w:bidi/>
+        <w:spacing w:after="160" w:line="300"/>
+        <w:jc w:val="right"/>
+      </w:pPr>
+      <w:r>
+        <w:rPr>
+          <w:rFonts w:ascii="Arial" w:cs="Arial" w:eastAsia="Arial" w:hAnsi="Arial"/>
+          <w:rtl/>
+        </w:rPr>
+        <w:t xml:space="preserve">זו בדיוק השאלה הנכונה, כי כל ארבעת המשטחים הפומביים שלנו אומרים שהמודל שנשלח הוא בדיוק המודל שההולדאוט בדק, והאריזה הסטנדרטית שלנו לא נטענת בסביבת הדפדפן. כלומר מה שרץ שם הוא מימוש מחדש, והמשפט הזה נכון רק כל עוד השניים מסכימים. אז הוכחנו, לא הצהרנו.</w:t>
+      </w:r>
+    </w:p>
+    <w:p>
+      <w:pPr>
+        <w:bidi/>
+        <w:spacing w:after="160" w:line="300"/>
+        <w:jc w:val="right"/>
+      </w:pPr>
+      <w:r>
+        <w:rPr>
+          <w:rFonts w:ascii="Arial" w:cs="Arial" w:eastAsia="Arial" w:hAnsi="Arial"/>
+          <w:rtl/>
+        </w:rPr>
+        <w:t xml:space="preserve">הפיקסצר מחויב לגיט ונבדק לפני הבנייה, לא נוצר על ידה. 54 ימי אספקה, 1296 שורות, 11628 ערכי קוונטיל, על פני שלושת המשטרים, שני כיווני מעבר שעון עם ימים של 23 ו-25 שעות, חגים פדרליים וימי גשר. התוצאה היא זהות בייט-לבייט, סטייה מוחלטת מקסימלית של אפס. בלי סובלנות, כי לא נדרשה. סובלנות שנבחרת כדי שמבחן יעבור היא כישלון של המבחן ולא הצלחה שלו.</w:t>
+      </w:r>
+    </w:p>
+    <w:p>
+      <w:pPr>
+        <w:bidi/>
+        <w:spacing w:after="160" w:line="300"/>
+        <w:jc w:val="right"/>
+      </w:pPr>
+      <w:r>
+        <w:rPr>
+          <w:rFonts w:ascii="Arial" w:cs="Arial" w:eastAsia="Arial" w:hAnsi="Arial"/>
+          <w:rtl/>
+        </w:rPr>
+        <w:t xml:space="preserve">והחשש האמיתי היה ספציפי: הבוסטרים אומנו עם בילד אחד של הספרייה על מק, ובסביבת ה-WebAssembly זה בילד אחר שנבנה בלי מקביליות. חיזוי הוא מעבר דטרמיניסטי על עצים וסכימה של מספרים, אז זהות סבירה, אבל היא לא מובטחת. לכן זה היה הדבר הראשון שנבדק ולא האחרון.</w:t>
+      </w:r>
+    </w:p>
+    <w:p>
+      <w:pPr>
+        <w:bidi/>
+        <w:spacing w:after="160" w:line="300"/>
+        <w:jc w:val="right"/>
+      </w:pPr>
+      <w:r>
+        <w:rPr>
+          <w:rFonts w:ascii="Arial" w:cs="Arial" w:eastAsia="Arial" w:hAnsi="Arial"/>
+          <w:rtl/>
+        </w:rPr>
+        <w:t xml:space="preserve">ויש ארבע בקרות חיוב שכולן שוברות את השער: הזזת סף אחד ב-0.01, ואפילו ב-1e-12, עץ אחד פחות, והחלפה בין שני ראשים. בלי אלה, מימוש שמחזיר תמיד את אותו דבר היה עובר. וכאורקסטרטור לא הסתפקתי בהרצה מחדש של הסוויטה שלו: בניתי את מודל הדפדפן בעצמי, ובחרתי ימי אספקה שהפיקסצר שלו בכלל לא מכיל. שוב אפס, וגם דפוסי ה-null זהים שורה בשורה.</w:t>
+      </w:r>
+    </w:p>
+    <w:p>
+      <w:pPr>
+        <w:bidi/>
+        <w:spacing w:after="160" w:line="300"/>
+        <w:jc w:val="right"/>
+      </w:pPr>
+      <w:r>
+        <w:rPr>
+          <w:rFonts w:ascii="Arial" w:cs="Arial" w:eastAsia="Arial" w:hAnsi="Arial"/>
+          <w:rtl/>
+        </w:rPr>
+        <w:t xml:space="preserve">ודבר אחרון שחשוב לי: על 238 ימים המודל בדפדפן מסרב לענות בכלל, כי מטען הנתונים שלו דליל ואין לו את חלון ההיסטוריה המלא. הוא נכשל סגור במקום להמציא. זו התנהגות נכונה, והאפליקציה ממילא לא מציעה את הימים האלה.</w:t>
+      </w:r>
+    </w:p>
+    <w:p>
+      <w:pPr>
+        <w:pBdr>
+          <w:bottom w:val="single" w:sz="6" w:space="1" w:color="C8C8C8"/>
+        </w:pBdr>
+        <w:bidi/>
+        <w:spacing w:after="240" w:before="80"/>
+      </w:pPr>
+    </w:p>
+    <w:p>
+      <w:pPr>
+        <w:pStyle w:val="Heading2"/>
+        <w:bidi/>
+        <w:spacing w:after="160" w:before="360"/>
+        <w:jc w:val="right"/>
+      </w:pPr>
+      <w:r>
+        <w:rPr>
+          <w:rFonts w:ascii="Arial" w:cs="Arial" w:eastAsia="Arial" w:hAnsi="Arial"/>
+          <w:color w:val="2A4B7C"/>
+          <w:sz w:val="26"/>
+          <w:szCs w:val="26"/>
+          <w:rtl/>
+        </w:rPr>
+        <w:t xml:space="preserve">23. איך אתה מארח דמו אינטראקטיבי בלי לשלם ובלי שהוא יירדם?</w:t>
+      </w:r>
+    </w:p>
+    <w:p>
+      <w:pPr>
+        <w:bidi/>
+        <w:spacing w:after="160" w:line="300"/>
+        <w:jc w:val="right"/>
+      </w:pPr>
+      <w:r>
+        <w:rPr>
+          <w:rFonts w:ascii="Arial" w:cs="Arial" w:eastAsia="Arial" w:hAnsi="Arial"/>
+          <w:rtl/>
+        </w:rPr>
+        <w:t xml:space="preserve">השכבה החינמית של הספק העבירה את כל המסלולים שמריצים קומפיוט למנוי בתשלום, ונשאר רק אירוח סטטי. אז במקום לשלם, שאלתי את השאלה שבאמת קובעת: האם עמוד סטטי נרדם. ולא הסתפקתי בהיגיון. שאלתי את ה-API על ארבעה עמודים סטטיים רדומים מזה שנים וכולם דיווחו RUNNING, בעוד שני עמודי דוקר דיווחו SLEEPING. הדוקס מגדירים שינה כלהפסיק להריץ, ולעמוד סטטי אין מה להריץ.</w:t>
+      </w:r>
+    </w:p>
+    <w:p>
+      <w:pPr>
+        <w:bidi/>
+        <w:spacing w:after="160" w:line="300"/>
+        <w:jc w:val="right"/>
+      </w:pPr>
+      <w:r>
+        <w:rPr>
+          <w:rFonts w:ascii="Arial" w:cs="Arial" w:eastAsia="Arial" w:hAnsi="Arial"/>
+          <w:rtl/>
+        </w:rPr>
+        <w:t xml:space="preserve">אז ייצאנו את המחברת ל-WebAssembly. הפייתון רץ אצל המבקר בדפדפן, והספק מגיש קבצים בלבד. זה חינם, וזה לא יכול להירדם, בזמן שדמו דוקר בשכבה החינמית היה נרדם בדיוק כשמגייס פותח אותו.</w:t>
+      </w:r>
+    </w:p>
+    <w:p>
+      <w:pPr>
+        <w:bidi/>
+        <w:spacing w:after="160" w:line="300"/>
+        <w:jc w:val="right"/>
+      </w:pPr>
+      <w:r>
+        <w:rPr>
+          <w:rFonts w:ascii="Arial" w:cs="Arial" w:eastAsia="Arial" w:hAnsi="Arial"/>
+          <w:rtl/>
+        </w:rPr>
+        <w:t xml:space="preserve">המחיר נמדד ומפורסם ולא מתואר: 352 בקשות, 57.25 מיליון בייט מחמישה מארחים בביקור ראשון, ומגה-בייט אחד בביקור חוזר. ושלוש עובדות פלטפורמה שגילינו בדרך קבעו את המבנה: הספק לא דוחס קבצים, קבצים בינאריים מנותבים דרך קישור חתום שמשתנה בכל פעם ולכן הדפדפן לא מטמין אותם, ולכן המודל נשלח כטקסט base64 של gzip. זה עולה 3.7 מגה על גבי בינארי, וזה מה שמוציא אותו ממסלול ההפניה שלא נטמן.</w:t>
+      </w:r>
+    </w:p>
+    <w:p>
+      <w:pPr>
+        <w:bidi/>
+        <w:spacing w:after="160" w:line="300"/>
+        <w:jc w:val="right"/>
+      </w:pPr>
+      <w:r>
+        <w:rPr>
+          <w:rFonts w:ascii="Arial" w:cs="Arial" w:eastAsia="Arial" w:hAnsi="Arial"/>
+          <w:rtl/>
+        </w:rPr>
+        <w:t xml:space="preserve">והדף הראשי נשאר מה שהיה: קובץ אחד עם אפס קריאות רשת, שנטען גם בלי אינטרנט. שני הדברים לא סותרים, הם חלוקת עבודה. הדף הסטטי לא יכול להישבר, והדמו האינטראקטיבי לא יכול להירדם.</w:t>
       </w:r>
     </w:p>
     <w:sectPr>

</xml_diff>

<commit_message>
fix: preserve Q&A numbering after Word saves and retain interview updates
</commit_message>
<xml_diff>
--- a/שאלות תשובות.docx
+++ b/שאלות תשובות.docx
@@ -4406,19 +4406,120 @@
     </w:p>
     <w:p>
       <w:pPr>
+        <w:bidi/>
+        <w:spacing w:after="160" w:line="300" w:lineRule="auto"/>
+        <w:jc w:val="right"/>
+      </w:pPr>
+    </w:p>
+    <w:p>
+      <w:pPr>
         <w:pBdr>
           <w:bottom w:val="single" w:sz="6" w:space="1" w:color="C8C8C8"/>
         </w:pBdr>
         <w:bidi/>
-        <w:spacing w:before="80" w:after="240"/>
-      </w:pPr>
-    </w:p>
-    <w:p>
-      <w:pPr>
-        <w:bidi/>
-        <w:spacing w:after="160" w:line="300" w:lineRule="auto"/>
-        <w:jc w:val="right"/>
-      </w:pPr>
+        <w:spacing w:after="240" w:before="80"/>
+      </w:pPr>
+    </w:p>
+    <w:p>
+      <w:pPr>
+        <w:pStyle w:val="Heading2"/>
+        <w:bidi/>
+        <w:spacing w:after="160" w:before="360"/>
+        <w:jc w:val="right"/>
+      </w:pPr>
+      <w:r>
+        <w:rPr>
+          <w:rFonts w:ascii="Arial" w:cs="Arial" w:eastAsia="Arial" w:hAnsi="Arial"/>
+          <w:color w:val="2A4B7C"/>
+          <w:sz w:val="26"/>
+          <w:szCs w:val="26"/>
+          <w:rtl/>
+        </w:rPr>
+        <w:t xml:space="preserve">31. למה עצרתם את CP-16 לפני ההשוואה, ומה גיליתם על תקציב הבדיקות ועל מנגנון הניטור?</w:t>
+      </w:r>
+    </w:p>
+    <w:p>
+      <w:pPr>
+        <w:bidi/>
+        <w:spacing w:after="160" w:line="300"/>
+        <w:jc w:val="right"/>
+      </w:pPr>
+      <w:r>
+        <w:rPr>
+          <w:rFonts w:ascii="Arial" w:cs="Arial" w:eastAsia="Arial" w:hAnsi="Arial"/>
+          <w:rtl/>
+        </w:rPr>
+        <w:t xml:space="preserve">בתכנון הראשוני ספרנו בחסר את ימי החימום בבדיקות הסינתטיות. כששחזרנו את חשבון ההרצות מתוך התיעוד, תיקנו את החיוב ל־3,730 מתוך 4,500 ימי־מדיניות. נשארו 770, בעוד שהשלמת הרצת הייצור לבדה דרשה עוד 1,200. עצרנו לפני השוואת קפלי ההערכה: לא מחקנו את החיובים, לא צמצמנו את אוכלוסיית היעד ולא הצגנו היעדר תוצאות כתוצאה מחקרית שלילית. המבקר העצמאי החזיר FAIL אף ש־59 בדיקות מוגבלות עברו, כי ההשוואה והאימותים הנדרשים לא הושלמו.</w:t>
+      </w:r>
+    </w:p>
+    <w:p>
+      <w:pPr>
+        <w:bidi/>
+        <w:spacing w:after="160" w:line="300"/>
+        <w:jc w:val="right"/>
+      </w:pPr>
+      <w:r>
+        <w:rPr>
+          <w:rFonts w:ascii="Arial" w:cs="Arial" w:eastAsia="Arial" w:hAnsi="Arial"/>
+          <w:rtl/>
+        </w:rPr>
+        <w:t xml:space="preserve">גילינו גם שמנטר המשאבים קרס בזמן החלפה אטומית של קובץ זמני והשאיר את תהליך העבודה פועל. עצרנו את התהליך, שמרנו את עקבות הכשל ותיקנו את המנטר כך שכשל בניטור עוצר גם את העבודה. הבדיקות המוגבלות של התיקון עברו, אבל לא טענו שהן מוכיחות בדיעבד את שיא הזיכרון או את מגבלות המקביליות בעבודות שלא נוטרו. שמרנו את הפערים האלה במפורש. הגדלת מכסה מחייבת החלטת בעלים; היא אינה מוחקת כשל קודם ואינה מחליפה הערכה מלאה וביקורת עצמאית חדשה.</w:t>
+      </w:r>
+    </w:p>
+    <w:p>
+      <w:pPr>
+        <w:pBdr>
+          <w:bottom w:val="single" w:sz="6" w:space="1" w:color="C8C8C8"/>
+        </w:pBdr>
+        <w:bidi/>
+        <w:spacing w:after="240" w:before="80"/>
+      </w:pPr>
+    </w:p>
+    <w:p>
+      <w:pPr>
+        <w:pStyle w:val="Heading2"/>
+        <w:bidi/>
+        <w:spacing w:after="160" w:before="360"/>
+        <w:jc w:val="right"/>
+      </w:pPr>
+      <w:r>
+        <w:rPr>
+          <w:rFonts w:ascii="Arial" w:cs="Arial" w:eastAsia="Arial" w:hAnsi="Arial"/>
+          <w:color w:val="2A4B7C"/>
+          <w:sz w:val="26"/>
+          <w:szCs w:val="26"/>
+          <w:rtl/>
+        </w:rPr>
+        <w:t xml:space="preserve">32. איך קיבלתם PASS הנדסי בלי להכריז על עדיפות מחקרית משותפת או על מודל כשיר למוצר?</w:t>
+      </w:r>
+    </w:p>
+    <w:p>
+      <w:pPr>
+        <w:bidi/>
+        <w:spacing w:after="160" w:line="300"/>
+        <w:jc w:val="right"/>
+      </w:pPr>
+      <w:r>
+        <w:rPr>
+          <w:rFonts w:ascii="Arial" w:cs="Arial" w:eastAsia="Arial" w:hAnsi="Arial"/>
+          <w:rtl/>
+        </w:rPr>
+        <w:t xml:space="preserve">ב־CP-16 השלמנו את ההשוואה הקבועה בין שכבת שאריות לפי שעה לבין הבקרה המאוגמת, על אותם קלטים ואותן שורות. הפקנו את כל 75,229 שורות התחזית, ומבקר עצמאי חישב מחדש את המדדים ושחזר בדיוק את 21,494 תחזיות שתי המדיניויות. לכן עברנו את בר ההשלמה ההנדסי. זה לא הופך את המדיניות למוצר כשיר: שתי המדיניויות החמיצו את שני ספי השיפור המקוריים.</w:t>
+      </w:r>
+    </w:p>
+    <w:p>
+      <w:pPr>
+        <w:bidi/>
+        <w:spacing w:after="160" w:line="300"/>
+        <w:jc w:val="right"/>
+      </w:pPr>
+      <w:r>
+        <w:rPr>
+          <w:rFonts w:ascii="Arial" w:cs="Arial" w:eastAsia="Arial" w:hAnsi="Arial"/>
+          <w:rtl/>
+        </w:rPr>
+        <w:t xml:space="preserve">השכבה לפי שעה דורגה ראשונה בתיאור התוצאות והציגה שיפור נתמך ב־WIS מול הבקרה. אבל בכלל המשותף שקבענו מראש נדרש גם שהקצה העליון של רווח הסמך להפרש MAE לא יהיה חיובי. הקצה היה בערך ‎+0.00000386‎ במדד המנורמל. לא עיגלנו אותו לאפס כדי להעביר את הכלל: דיווחנו שאין עדיפות משותפת שהודגמה, בלי לטעון לשקילות או להיעדר תועלת. מול B2 כן התקיים כלל השיפור המשותף החקרני, וכל הממצאים נשארו מסומנים כתוצאות פיתוח אחרי בחירה. שמרנו על ההבחנה בין ניסוי שהושלם כראוי, מסקנה מחקרית וכשירות למוצר.</w:t>
+      </w:r>
     </w:p>
     <w:sectPr>
       <w:pgSz w:w="11906" w:h="16838"/>

</xml_diff>

<commit_message>
docs: ratify CP-20 direct-weather ablation and reconcile programme state
</commit_message>
<xml_diff>
--- a/שאלות תשובות.docx
+++ b/שאלות תשובות.docx
@@ -4519,6 +4519,47 @@
           <w:rtl/>
         </w:rPr>
         <w:t xml:space="preserve">השכבה לפי שעה דורגה ראשונה בתיאור התוצאות והציגה שיפור נתמך ב־WIS מול הבקרה. אבל בכלל המשותף שקבענו מראש נדרש גם שהקצה העליון של רווח הסמך להפרש MAE לא יהיה חיובי. הקצה היה בערך ‎+0.00000386‎ במדד המנורמל. לא עיגלנו אותו לאפס כדי להעביר את הכלל: דיווחנו שאין עדיפות משותפת שהודגמה, בלי לטעון לשקילות או להיעדר תועלת. מול B2 כן התקיים כלל השיפור המשותף החקרני, וכל הממצאים נשארו מסומנים כתוצאות פיתוח אחרי בחירה. שמרנו על ההבחנה בין ניסוי שהושלם כראוי, מסקנה מחקרית וכשירות למוצר.</w:t>
+      </w:r>
+    </w:p>
+    <w:p>
+      <w:pPr>
+        <w:pBdr>
+          <w:bottom w:val="single" w:sz="6" w:space="1" w:color="C8C8C8"/>
+        </w:pBdr>
+        <w:bidi/>
+        <w:spacing w:after="240" w:before="80"/>
+      </w:pPr>
+    </w:p>
+    <w:p>
+      <w:pPr>
+        <w:pStyle w:val="Heading2"/>
+        <w:bidi/>
+        <w:spacing w:after="160" w:before="360"/>
+        <w:jc w:val="right"/>
+      </w:pPr>
+      <w:r>
+        <w:rPr>
+          <w:rFonts w:ascii="Arial" w:cs="Arial" w:eastAsia="Arial" w:hAnsi="Arial"/>
+          <w:color w:val="2A4B7C"/>
+          <w:sz w:val="26"/>
+          <w:szCs w:val="26"/>
+          <w:rtl/>
+        </w:rPr>
+        <w:t xml:space="preserve">33. איך החלטנו שארכיון מזג אוויר מתאים לניסוי היסטורי בלי לטעון לזמינות מושלמת בכל יום?</w:t>
+      </w:r>
+    </w:p>
+    <w:p>
+      <w:pPr>
+        <w:bidi/>
+        <w:spacing w:after="160" w:line="300"/>
+        <w:jc w:val="right"/>
+      </w:pPr>
+      <w:r>
+        <w:rPr>
+          <w:rFonts w:ascii="Arial" w:cs="Arial" w:eastAsia="Arial" w:hAnsi="Arial"/>
+          <w:rtl/>
+        </w:rPr>
+        <w:t xml:space="preserve">קיבלנו את GFS למחקר על סמך מלאי הריצות, דגימות מפוענחות ותיעוד היסטורי מתוארך, ושמרנו במפורש את ההבדל בין מדידה להנחה. בחלק מקובצי NCAR הסקנו נוכחות שדות משלמות הקובץ ומדגימות של אותה גרסה; זמינות לפני מועד התחזית שוחזרה מתיעוד היצרן ואינה הוכחה לאספקה רציפה. לא ייבאנו את ריצת 2018 הדרושה למזג האוויר של 1 בינואר 2019, ולכן היום הזה נשאר חסר מבנית. בהשוואת חלונות החימום מצאנו גם שמונה ריצות נוספות שצריך לבדוק לפני האימון. הכנו מפרט שמקבע מראש המרה, טיפול בחוסרים ומגבלות משאבים, בלי להריץ את הניסוי ובלי להציג את הטיוטה כאישור ביצוע.</w:t>
       </w:r>
     </w:p>
     <w:sectPr>

</xml_diff>

<commit_message>
docs: record the ratified standard in programme state; add interview answer 34
progress.md: the standing publication rule, the conformance task and its
next steps, and the session log. The Q&A document gains entry 34, filed
under AGENTS.md § Interview-answer capture (a quality process that worked
as designed but buried the strongest result, and the standard that
followed).

Co-Authored-By: Claude Opus 5.5 <noreply@anthropic.com>
</commit_message>
<xml_diff>
--- a/שאלות תשובות.docx
+++ b/שאלות תשובות.docx
@@ -4560,6 +4560,107 @@
           <w:rtl/>
         </w:rPr>
         <w:t xml:space="preserve">קיבלנו את GFS למחקר על סמך מלאי הריצות, דגימות מפוענחות ותיעוד היסטורי מתוארך, ושמרנו במפורש את ההבדל בין מדידה להנחה. בחלק מקובצי NCAR הסקנו נוכחות שדות משלמות הקובץ ומדגימות של אותה גרסה; זמינות לפני מועד התחזית שוחזרה מתיעוד היצרן ואינה הוכחה לאספקה רציפה. לא ייבאנו את ריצת 2018 הדרושה למזג האוויר של 1 בינואר 2019, ולכן היום הזה נשאר חסר מבנית. בהשוואת חלונות החימום מצאנו גם שמונה ריצות נוספות שצריך לבדוק לפני האימון. הכנו מפרט שמקבע מראש המרה, טיפול בחוסרים ומגבלות משאבים, בלי להריץ את הניסוי ובלי להציג את הטיוטה כאישור ביצוע.</w:t>
+      </w:r>
+    </w:p>
+    <w:p>
+      <w:pPr>
+        <w:pBdr>
+          <w:bottom w:val="single" w:sz="6" w:space="1" w:color="C8C8C8"/>
+        </w:pBdr>
+        <w:bidi/>
+        <w:spacing w:after="240" w:before="80"/>
+      </w:pPr>
+    </w:p>
+    <w:p>
+      <w:pPr>
+        <w:pStyle w:val="Heading2"/>
+        <w:bidi/>
+        <w:spacing w:after="160" w:before="360"/>
+        <w:jc w:val="right"/>
+      </w:pPr>
+      <w:r>
+        <w:rPr>
+          <w:rFonts w:ascii="Arial" w:cs="Arial" w:eastAsia="Arial" w:hAnsi="Arial"/>
+          <w:color w:val="2A4B7C"/>
+          <w:sz w:val="26"/>
+          <w:szCs w:val="26"/>
+          <w:rtl/>
+        </w:rPr>
+        <w:t xml:space="preserve">34. ספר על מקרה שבו תהליך הבקרה שלכם עבד בדיוק כפי שתוכנן, ובכל זאת הוביל לתוצאה לא טובה. מה עשיתם?</w:t>
+      </w:r>
+    </w:p>
+    <w:p>
+      <w:pPr>
+        <w:bidi/>
+        <w:spacing w:after="160" w:line="300"/>
+        <w:jc w:val="right"/>
+      </w:pPr>
+      <w:r>
+        <w:rPr>
+          <w:rFonts w:ascii="Arial" w:cs="Arial" w:eastAsia="Arial" w:hAnsi="Arial"/>
+          <w:rtl/>
+        </w:rPr>
+        <w:t xml:space="preserve">בפרויקט חיזוי מחירי החשמל בנינו שכבת ראיות שבה כל מספר בעמוד הציבורי נגזר מרשומה מאומתת, ובודק עצמאי אימת 734 מספרים מוצגים מול קבצי המקור. ובכל זאת, העמוד שעמד לצאת הסתיר את התוצאה החזקה ביותר שלנו: </w:t>
+      </w:r>
+      <w:r>
+        <w:rPr>
+          <w:rFonts w:ascii="Arial" w:cs="Arial" w:eastAsia="Arial" w:hAnsi="Arial"/>
+          <w:b/>
+          <w:bCs/>
+          <w:rtl/>
+        </w:rPr>
+        <w:t xml:space="preserve">v3 היה הראשון מתוך 8 מדיניות שעמד ביעדי הדיוק שקבענו מראש</w:t>
+      </w:r>
+      <w:r>
+        <w:rPr>
+          <w:rFonts w:ascii="Arial" w:cs="Arial" w:eastAsia="Arial" w:hAnsi="Arial"/>
+          <w:rtl/>
+        </w:rPr>
+        <w:t xml:space="preserve"> — לפחות 10% טוב יותר מהבנצ'מרק החזק ביותר בשני המדדים — וזה לא הופיע במסך הראשון.</w:t>
+      </w:r>
+    </w:p>
+    <w:p>
+      <w:pPr>
+        <w:bidi/>
+        <w:spacing w:after="160" w:line="300"/>
+        <w:jc w:val="right"/>
+      </w:pPr>
+      <w:r>
+        <w:rPr>
+          <w:rFonts w:ascii="Arial" w:cs="Arial" w:eastAsia="Arial" w:hAnsi="Arial"/>
+          <w:rtl/>
+        </w:rPr>
+        <w:t xml:space="preserve">כשחקרנו למה, מצאנו שהבעיה לא בקוד אלא בתקן. התוכנית הגדירה בפירוט מה אסור לומר, ולא הגדירה מה חובה לומר ואיפה. כל סבב ביקורת נבדק מול הרף של הסבב הקודם, ולכן יכול היה רק להוסיף הסתייגויות; מבחן הקורא בדק אם אפשר למצוא תשובה, לא אם רואים אותה. בגרסה הראשונה המספר היה במסך הראשון; אחרי סבבי הביקורת הוא ירד למסך החמישי, ומבחן הקורא עבר בכל סבב.</w:t>
+      </w:r>
+    </w:p>
+    <w:p>
+      <w:pPr>
+        <w:bidi/>
+        <w:spacing w:after="160" w:line="300"/>
+        <w:jc w:val="right"/>
+      </w:pPr>
+      <w:r>
+        <w:rPr>
+          <w:rFonts w:ascii="Arial" w:cs="Arial" w:eastAsia="Arial" w:hAnsi="Arial"/>
+          <w:rtl/>
+        </w:rPr>
+        <w:t xml:space="preserve">במקום להוסיף עוד טלאי, </w:t>
+      </w:r>
+      <w:r>
+        <w:rPr>
+          <w:rFonts w:ascii="Arial" w:cs="Arial" w:eastAsia="Arial" w:hAnsi="Arial"/>
+          <w:b/>
+          <w:bCs/>
+          <w:rtl/>
+        </w:rPr>
+        <w:t xml:space="preserve">עצרנו את הפרסום וכתבנו סטנדרט פרסום</w:t>
+      </w:r>
+      <w:r>
+        <w:rPr>
+          <w:rFonts w:ascii="Arial" w:cs="Arial" w:eastAsia="Arial" w:hAnsi="Arial"/>
+          <w:rtl/>
+        </w:rPr>
+        <w:t xml:space="preserve"> לכל הגרסאות הבאות: כותרת שמוגדרת לפני שיש תוצאה, כל אחוז כרשומה נגזרת ובדוקה, רשימת דורות אחת שממנה נגזרים שמות וסטטוסים, כלל חסימה שמבחין בין הפרה של הסטנדרט לבין הערה מייעצת, וערוץ מסודר לתקן את הסטנדרט עצמו. את הניתוח העמדנו מול סוכן עצמאי בשלושה סבבים — בראשון הוא קרא את העמוד בלי לראות את העמדה שלנו — ובדקנו כל טענה שלו מול ה־repo לפני שאימצנו אותה.</w:t>
       </w:r>
     </w:p>
     <w:sectPr>

</xml_diff>

<commit_message>
docs: record PRES-1 receipt, F5 approval and explicit publication authority
</commit_message>
<xml_diff>
--- a/שאלות תשובות.docx
+++ b/שאלות תשובות.docx
@@ -4661,6 +4661,47 @@
           <w:rtl/>
         </w:rPr>
         <w:t xml:space="preserve"> לכל הגרסאות הבאות: כותרת שמוגדרת לפני שיש תוצאה, כל אחוז כרשומה נגזרת ובדוקה, רשימת דורות אחת שממנה נגזרים שמות וסטטוסים, כלל חסימה שמבחין בין הפרה של הסטנדרט לבין הערה מייעצת, וערוץ מסודר לתקן את הסטנדרט עצמו. את הניתוח העמדנו מול סוכן עצמאי בשלושה סבבים — בראשון הוא קרא את העמוד בלי לראות את העמדה שלנו — ובדקנו כל טענה שלו מול ה־repo לפני שאימצנו אותה.</w:t>
+      </w:r>
+    </w:p>
+    <w:p>
+      <w:pPr>
+        <w:pBdr>
+          <w:bottom w:val="single" w:sz="6" w:space="1" w:color="C8C8C8"/>
+        </w:pBdr>
+        <w:bidi/>
+        <w:spacing w:after="240" w:before="80"/>
+      </w:pPr>
+    </w:p>
+    <w:p>
+      <w:pPr>
+        <w:pStyle w:val="Heading2"/>
+        <w:bidi/>
+        <w:spacing w:after="160" w:before="360"/>
+        <w:jc w:val="right"/>
+      </w:pPr>
+      <w:r>
+        <w:rPr>
+          <w:rFonts w:ascii="Arial" w:cs="Arial" w:eastAsia="Arial" w:hAnsi="Arial"/>
+          <w:color w:val="2A4B7C"/>
+          <w:sz w:val="26"/>
+          <w:szCs w:val="26"/>
+          <w:rtl/>
+        </w:rPr>
+        <w:t xml:space="preserve">35. איך בדקנו שהמספר ״הראשון מתוך שמונה מודלים״ לא תלוי בסדר השורות בקובץ?</w:t>
+      </w:r>
+    </w:p>
+    <w:p>
+      <w:pPr>
+        <w:bidi/>
+        <w:spacing w:after="160" w:line="300"/>
+        <w:jc w:val="right"/>
+      </w:pPr>
+      <w:r>
+        <w:rPr>
+          <w:rFonts w:ascii="Arial" w:cs="Arial" w:eastAsia="Arial" w:hAnsi="Arial"/>
+          <w:rtl/>
+        </w:rPr>
+        <w:t xml:space="preserve">בביקורת העצמאית של עמוד המחקר מצאנו שספירה מצטברת לפי סדר שורות בקובץ אינה מייצגת בהכרח את מה שהיה ידוע במועד ההחלטה. תיקנו את הספירה כך שתיגזר מתאריכי ההחלטות המתועדים ומזהות אחידה לכל מדיניות, בלי לספור את אותו מודל פעמיים בגלל קוד ניסוי שונה. הוספנו בקרות לשינוי סדר השורות, לספירה שגויה ולסימון שגוי של הראשון שעמד ביעדים. בודק עצמאי שחזר את המספרים מתוך הרשומות המקוריות ואישר את הספירות 5, 7 ו־8. כך המספר בכותרת מבטא את היסטוריית המחקר ולא פרט מקרי של קובץ התצוגה. שמרנו את הביקורות שנכשלו, וההצלחה נשארה מסומנת כתוצאת פיתוח לאחר בחירה, לא כהוכחה על נתונים חדשים או כהסמכת מוצר.</w:t>
       </w:r>
     </w:p>
     <w:sectPr>

</xml_diff>

<commit_message>
Finalize v21-r5 and publication anchor
Ratify the v21-r5 final-product lifecycle amendment, including the Owner-designated product/demo identity, policy freeze, daily retraining/issuance requirements, and the product-first page order. Update PUBLISH_RULES to v1.1 with A8 and strengthened A7, and align the amendment record, publication packet/runbook, handoff notes, and progress tracking with the new final-product and daily-operation contract. Historical v21-r4/PRES-2 documents remain preserved.
</commit_message>
<xml_diff>
--- a/שאלות תשובות.docx
+++ b/שאלות תשובות.docx
@@ -4702,6 +4702,61 @@
           <w:rtl/>
         </w:rPr>
         <w:t xml:space="preserve">בביקורת העצמאית של עמוד המחקר מצאנו שספירה מצטברת לפי סדר שורות בקובץ אינה מייצגת בהכרח את מה שהיה ידוע במועד ההחלטה. תיקנו את הספירה כך שתיגזר מתאריכי ההחלטות המתועדים ומזהות אחידה לכל מדיניות, בלי לספור את אותו מודל פעמיים בגלל קוד ניסוי שונה. הוספנו בקרות לשינוי סדר השורות, לספירה שגויה ולסימון שגוי של הראשון שעמד ביעדים. בודק עצמאי שחזר את המספרים מתוך הרשומות המקוריות ואישר את הספירות 5, 7 ו־8. כך המספר בכותרת מבטא את היסטוריית המחקר ולא פרט מקרי של קובץ התצוגה. שמרנו את הביקורות שנכשלו, וההצלחה נשארה מסומנת כתוצאת פיתוח לאחר בחירה, לא כהוכחה על נתונים חדשים או כהסמכת מוצר.</w:t>
+      </w:r>
+    </w:p>
+    <w:p>
+      <w:pPr>
+        <w:pBdr>
+          <w:bottom w:val="single" w:sz="6" w:space="1" w:color="C8C8C8"/>
+        </w:pBdr>
+        <w:bidi/>
+        <w:spacing w:after="240" w:before="80"/>
+      </w:pPr>
+    </w:p>
+    <w:p>
+      <w:pPr>
+        <w:pStyle w:val="Heading2"/>
+        <w:bidi/>
+        <w:spacing w:after="160" w:before="360"/>
+        <w:jc w:val="right"/>
+      </w:pPr>
+      <w:r>
+        <w:rPr>
+          <w:rFonts w:ascii="Arial" w:cs="Arial" w:eastAsia="Arial" w:hAnsi="Arial"/>
+          <w:color w:val="2A4B7C"/>
+          <w:sz w:val="26"/>
+          <w:szCs w:val="26"/>
+          <w:rtl/>
+        </w:rPr>
+        <w:t xml:space="preserve">36. איך אפשר להקפיא מוצר חיזוי ובכל זאת לאמן אותו מחדש מדי יום, ומה בדיוק מוצג למשתמש?</w:t>
+      </w:r>
+    </w:p>
+    <w:p>
+      <w:pPr>
+        <w:bidi/>
+        <w:spacing w:after="160" w:line="300"/>
+        <w:jc w:val="right"/>
+      </w:pPr>
+      <w:r>
+        <w:rPr>
+          <w:rFonts w:ascii="Arial" w:cs="Arial" w:eastAsia="Arial" w:hAnsi="Arial"/>
+          <w:rtl/>
+        </w:rPr>
+        <w:t xml:space="preserve">עיגנו בחוזה המוצר הקפאה של המדיניות, ולא של כל המשקולות לעד: האלגוריתם, הפיצ׳רים, ההיפרפרמטרים, חלון האימון, זמינות התוויות וכללי הכשל נקבעים מראש. בתוך המדיניות הזו המוצר הסופי חייב להתאמן ולהפיק תחזיות מדי יום, וכל תוצר נשמר עם זהות ושרשרת מקור. רענון קלט או החלפת הקשר בלבד אינם אימון מחדש; חריגה מחובת האימון היומי דורשת החלטה מפורשת. זהו חוזה לעבודה העתידית, והמערכת היומית עדיין לא הופעלה.</w:t>
+      </w:r>
+    </w:p>
+    <w:p>
+      <w:pPr>
+        <w:bidi/>
+        <w:spacing w:after="160" w:line="300"/>
+        <w:jc w:val="right"/>
+      </w:pPr>
+      <w:r>
+        <w:rPr>
+          <w:rFonts w:ascii="Arial" w:cs="Arial" w:eastAsia="Arial" w:hAnsi="Arial"/>
+          <w:rtl/>
+        </w:rPr>
+        <w:t xml:space="preserve">קבענו שהגרסה הסופית שנבחרת, המוצר, הדמו והמערכת היומית יהיו אותו מודל. בראש האתר יוצגו התחזיות שנמסרו להיום מול המחירים שהתפרסמו, מדד הצלחה באחוזים שהנוסחה שלו הוגדרה מראש לצד טעות במחיר, ותחזיות מחר עם טווחי חיזוי. נבחין בין רמת הטווח הנומינלית לבין הכיסוי שנמדד בעבר. אחריהם יופיעו הסבר המוצר, תוצאות מחקריות, תובנות עסקיות ורק אז השוואת המודלים. רווח מצטבר יוצג מתוך מדיניות שימוש שנבדקה עם עלויות ובסיס השוואה; דיוק בחיזוי אינו כשלעצמו הוכחת רווח.</w:t>
       </w:r>
     </w:p>
     <w:sectPr>

</xml_diff>

<commit_message>
docs: regenerate programme state after CP-21's landing
A full progress.md regeneration at the Owner's request, under the
Orchestrator's regeneration contract, with the omission review recorded
in the Session Log.

- CP-21 is recorded as landed: v4 (HGL) adopted in research, verified by
  the read-only receipt checks against evidence/cp-21 (six candidate
  commits, 70 files, a verdict-only delta, every cited SHA reachable, the
  v21-r6 anchor bytes at the tag).
- PRES-3 is the next pending Track B checkpoint; its Owner inputs and
  CP-21's unconfirmed local reclamation are in Setup State and Open
  Questions, with the pending move of "same information, same opponent"
  from HG to v4.
- Closed CP-21 and PRES-2 detail is compressed; decision reasons and
  identities are kept.
- Q&A entries 39-42 file the four triggers CP-21's Lead named.

Co-Authored-By: Claude Opus 5.5 <noreply@anthropic.com>
Claude-Session: https://claude.ai/code/session_011LrWmBcixAt4m22Vm1wFQt
</commit_message>
<xml_diff>
--- a/שאלות תשובות.docx
+++ b/שאלות תשובות.docx
@@ -4987,6 +4987,274 @@
           <w:rtl/>
         </w:rPr>
         <w:t xml:space="preserve">. טענה פומבית תציין את הסטייה שנמדדה, וזהות ביט-לביט רק אם נמדדה בפועל.</w:t>
+      </w:r>
+    </w:p>
+    <w:p>
+      <w:pPr>
+        <w:pBdr>
+          <w:bottom w:val="single" w:sz="6" w:space="1" w:color="C8C8C8"/>
+        </w:pBdr>
+        <w:bidi/>
+        <w:spacing w:after="240" w:before="80"/>
+      </w:pPr>
+    </w:p>
+    <w:p>
+      <w:pPr>
+        <w:pStyle w:val="Heading2"/>
+        <w:bidi/>
+        <w:spacing w:after="160" w:before="360"/>
+        <w:jc w:val="right"/>
+      </w:pPr>
+      <w:r>
+        <w:rPr>
+          <w:rFonts w:ascii="Arial" w:cs="Arial" w:eastAsia="Arial" w:hAnsi="Arial"/>
+          <w:color w:val="2A4B7C"/>
+          <w:sz w:val="26"/>
+          <w:szCs w:val="26"/>
+          <w:rtl/>
+        </w:rPr>
+        <w:t xml:space="preserve">39. מודל ה-LightGBM קיבל hash שונה כשרץ עם thread אחד ועם ארבעה. איך בדקתם אם האימון באמת לא דטרמיניסטי?</w:t>
+      </w:r>
+    </w:p>
+    <w:p>
+      <w:pPr>
+        <w:bidi/>
+        <w:spacing w:after="160" w:line="300"/>
+        <w:jc w:val="right"/>
+      </w:pPr>
+      <w:r>
+        <w:rPr>
+          <w:rFonts w:ascii="Arial" w:cs="Arial" w:eastAsia="Arial" w:hAnsi="Arial"/>
+          <w:rtl/>
+        </w:rPr>
+        <w:t xml:space="preserve">לא הנחנו שזה רעש. עקבנו אחרי ההבדל עד המקור שלו: קובץ המודל השמור רושם את הפרמטר num_threads, וזה מה ששינה את ה-hash, </w:t>
+      </w:r>
+      <w:r>
+        <w:rPr>
+          <w:rFonts w:ascii="Arial" w:cs="Arial" w:eastAsia="Arial" w:hAnsi="Arial"/>
+          <w:b/>
+          <w:bCs/>
+          <w:rtl/>
+        </w:rPr>
+        <w:t xml:space="preserve">לא העצים עצמם</w:t>
+      </w:r>
+      <w:r>
+        <w:rPr>
+          <w:rFonts w:ascii="Arial" w:cs="Arial" w:eastAsia="Arial" w:hAnsi="Arial"/>
+          <w:rtl/>
+        </w:rPr>
+        <w:t xml:space="preserve">.</w:t>
+      </w:r>
+    </w:p>
+    <w:p>
+      <w:pPr>
+        <w:bidi/>
+        <w:spacing w:after="160" w:line="300"/>
+        <w:jc w:val="right"/>
+      </w:pPr>
+      <w:r>
+        <w:rPr>
+          <w:rFonts w:ascii="Arial" w:cs="Arial" w:eastAsia="Arial" w:hAnsi="Arial"/>
+          <w:rtl/>
+        </w:rPr>
+        <w:t xml:space="preserve">הוכחנו את זה על 24 מקרים אמיתיים: העצים זהים בין ההגדרות. בריצה הראשית הרצנו ארבעה תהליכים של thread אחד כל אחד, כך שכל אימון משוחזר בדיוק, והמקביליות באה מתהליכים ולא מ-threads.</w:t>
+      </w:r>
+    </w:p>
+    <w:p>
+      <w:pPr>
+        <w:pBdr>
+          <w:bottom w:val="single" w:sz="6" w:space="1" w:color="C8C8C8"/>
+        </w:pBdr>
+        <w:bidi/>
+        <w:spacing w:after="240" w:before="80"/>
+      </w:pPr>
+    </w:p>
+    <w:p>
+      <w:pPr>
+        <w:pStyle w:val="Heading2"/>
+        <w:bidi/>
+        <w:spacing w:after="160" w:before="360"/>
+        <w:jc w:val="right"/>
+      </w:pPr>
+      <w:r>
+        <w:rPr>
+          <w:rFonts w:ascii="Arial" w:cs="Arial" w:eastAsia="Arial" w:hAnsi="Arial"/>
+          <w:color w:val="2A4B7C"/>
+          <w:sz w:val="26"/>
+          <w:szCs w:val="26"/>
+          <w:rtl/>
+        </w:rPr>
+        <w:t xml:space="preserve">40. מאיפה בא השיפור של v4: מהפיצול לשלושה בלוקים של שעות, או ממשהו אחר?</w:t>
+      </w:r>
+    </w:p>
+    <w:p>
+      <w:pPr>
+        <w:bidi/>
+        <w:spacing w:after="160" w:line="300"/>
+        <w:jc w:val="right"/>
+      </w:pPr>
+      <w:r>
+        <w:rPr>
+          <w:rFonts w:ascii="Arial" w:cs="Arial" w:eastAsia="Arial" w:hAnsi="Arial"/>
+          <w:rtl/>
+        </w:rPr>
+        <w:t xml:space="preserve">מהוספת לומד לא-לינארי ל-v3, </w:t>
+      </w:r>
+      <w:r>
+        <w:rPr>
+          <w:rFonts w:ascii="Arial" w:cs="Arial" w:eastAsia="Arial" w:hAnsi="Arial"/>
+          <w:b/>
+          <w:bCs/>
+          <w:rtl/>
+        </w:rPr>
+        <w:t xml:space="preserve">לא מחלוקת היום</w:t>
+      </w:r>
+      <w:r>
+        <w:rPr>
+          <w:rFonts w:ascii="Arial" w:cs="Arial" w:eastAsia="Arial" w:hAnsi="Arial"/>
+          <w:rtl/>
+        </w:rPr>
+        <w:t xml:space="preserve">. v4 מוסיף לשני מודלי ה-LEAR של v3 רכיב LightGBM במשקל שליש, ועל 10,747 שעות הפיתוח הוא שיפר את v3 ב-5.3% בשגיאה הנקודתית וב-5.0% בציון המרווחים, עם רווחי סמך שכולם מתחת לאפס. זו ראיית פיתוח אחרי בחירה, לא מבחן על נתונים חדשים.</w:t>
+      </w:r>
+    </w:p>
+    <w:p>
+      <w:pPr>
+        <w:bidi/>
+        <w:spacing w:after="160" w:line="300"/>
+        <w:jc w:val="right"/>
+      </w:pPr>
+      <w:r>
+        <w:rPr>
+          <w:rFonts w:ascii="Arial" w:cs="Arial" w:eastAsia="Arial" w:hAnsi="Arial"/>
+          <w:rtl/>
+        </w:rPr>
+        <w:t xml:space="preserve">כדי לבדוק את הפיצול עצמו הוספנו מראש זרוע ביקורת: LightGBM אחד לכל 24 השעות. ההשוואה בין הבלוקים למודל האחד לא הראתה העדפה משותפת מובהקת, ושתי הנקודות אפילו נטו מעט לרעת הבלוקים. לכן אנחנו לא טוענים שהבלוקים עזרו; אנחנו טוענים שהבלנד עזר.</w:t>
+      </w:r>
+    </w:p>
+    <w:p>
+      <w:pPr>
+        <w:pBdr>
+          <w:bottom w:val="single" w:sz="6" w:space="1" w:color="C8C8C8"/>
+        </w:pBdr>
+        <w:bidi/>
+        <w:spacing w:after="240" w:before="80"/>
+      </w:pPr>
+    </w:p>
+    <w:p>
+      <w:pPr>
+        <w:pStyle w:val="Heading2"/>
+        <w:bidi/>
+        <w:spacing w:after="160" w:before="360"/>
+        <w:jc w:val="right"/>
+      </w:pPr>
+      <w:r>
+        <w:rPr>
+          <w:rFonts w:ascii="Arial" w:cs="Arial" w:eastAsia="Arial" w:hAnsi="Arial"/>
+          <w:color w:val="2A4B7C"/>
+          <w:sz w:val="26"/>
+          <w:szCs w:val="26"/>
+          <w:rtl/>
+        </w:rPr>
+        <w:t xml:space="preserve">41. איך וידאתם שההבדל בין v3 ל-v4 נובע מהמודל ולא מהבדל בקוד?</w:t>
+      </w:r>
+    </w:p>
+    <w:p>
+      <w:pPr>
+        <w:bidi/>
+        <w:spacing w:after="160" w:line="300"/>
+        <w:jc w:val="right"/>
+      </w:pPr>
+      <w:r>
+        <w:rPr>
+          <w:rFonts w:ascii="Arial" w:cs="Arial" w:eastAsia="Arial" w:hAnsi="Arial"/>
+          <w:rtl/>
+        </w:rPr>
+        <w:t xml:space="preserve">כל הזרועות, כולל v3 עצמו, עוברות דרך אותה מחלקה קפואה של שכבת המרווחים. זרוע עם תחזית יחידה מעבירה אותה פעמיים כשני חצאים, כי c/2 + c/2 שווה ל-c בדיוק בנקודה צפה, כך שאין מסלול קוד נפרד לאף זרוע.</w:t>
+      </w:r>
+    </w:p>
+    <w:p>
+      <w:pPr>
+        <w:bidi/>
+        <w:spacing w:after="160" w:line="300"/>
+        <w:jc w:val="right"/>
+      </w:pPr>
+      <w:r>
+        <w:rPr>
+          <w:rFonts w:ascii="Arial" w:cs="Arial" w:eastAsia="Arial" w:hAnsi="Arial"/>
+          <w:rtl/>
+        </w:rPr>
+        <w:t xml:space="preserve">אחר כך שחזרנו את v3 דרך המסלול החדש </w:t>
+      </w:r>
+      <w:r>
+        <w:rPr>
+          <w:rFonts w:ascii="Arial" w:cs="Arial" w:eastAsia="Arial" w:hAnsi="Arial"/>
+          <w:b/>
+          <w:bCs/>
+          <w:rtl/>
+        </w:rPr>
+        <w:t xml:space="preserve">ביט-לביט</w:t>
+      </w:r>
+      <w:r>
+        <w:rPr>
+          <w:rFonts w:ascii="Arial" w:cs="Arial" w:eastAsia="Arial" w:hAnsi="Arial"/>
+          <w:rtl/>
+        </w:rPr>
+        <w:t xml:space="preserve">, על כל 10,747 המפתחות. כש-v3 יוצא זהה בדיוק, כל הבדל בציונים שייך למודל ולא לצנרת.</w:t>
+      </w:r>
+    </w:p>
+    <w:p>
+      <w:pPr>
+        <w:pBdr>
+          <w:bottom w:val="single" w:sz="6" w:space="1" w:color="C8C8C8"/>
+        </w:pBdr>
+        <w:bidi/>
+        <w:spacing w:after="240" w:before="80"/>
+      </w:pPr>
+    </w:p>
+    <w:p>
+      <w:pPr>
+        <w:pStyle w:val="Heading2"/>
+        <w:bidi/>
+        <w:spacing w:after="160" w:before="360"/>
+        <w:jc w:val="right"/>
+      </w:pPr>
+      <w:r>
+        <w:rPr>
+          <w:rFonts w:ascii="Arial" w:cs="Arial" w:eastAsia="Arial" w:hAnsi="Arial"/>
+          <w:color w:val="2A4B7C"/>
+          <w:sz w:val="26"/>
+          <w:szCs w:val="26"/>
+          <w:rtl/>
+        </w:rPr>
+        <w:t xml:space="preserve">42. מה עשיתם כשהסקירה הבלתי תלויה נקטעה באמצע?</w:t>
+      </w:r>
+    </w:p>
+    <w:p>
+      <w:pPr>
+        <w:bidi/>
+        <w:spacing w:after="160" w:line="300"/>
+        <w:jc w:val="right"/>
+      </w:pPr>
+      <w:r>
+        <w:rPr>
+          <w:rFonts w:ascii="Arial" w:cs="Arial" w:eastAsia="Arial" w:hAnsi="Arial"/>
+          <w:rtl/>
+        </w:rPr>
+        <w:t xml:space="preserve">מגבלת API עצרה את סשן הסוקר הראשון לפני שכתב פסק דין. לא המשכנו אותו ולא הסתמכנו על הטיוטות שלו: סוקר חדש קיבל checkout נקי של אותו commit, ופסק הדין המחייב שלו היה PASS. את החישוב של שני הסשנים חייבנו בתקציב.</w:t>
+      </w:r>
+    </w:p>
+    <w:p>
+      <w:pPr>
+        <w:bidi/>
+        <w:spacing w:after="160" w:line="300"/>
+        <w:jc w:val="right"/>
+      </w:pPr>
+      <w:r>
+        <w:rPr>
+          <w:rFonts w:ascii="Arial" w:cs="Arial" w:eastAsia="Arial" w:hAnsi="Arial"/>
+          <w:rtl/>
+        </w:rPr>
+        <w:t xml:space="preserve">מעברי הציון וה-bootstrap היו מוגבלים לשלושה כל אחד, והם הספיקו בדיוק, כי תכננו את הבדיקות האוטומטיות כך שאף פעם לא ינצלו מעבר מוגבל. התקציב נשמר גם כשמשהו נשבר.</w:t>
       </w:r>
     </w:p>
     <w:sectPr>

</xml_diff>

<commit_message>
docs: close PRES-3 (v4 on every surface) with its public receipt
Record PRES-3's closure: the Owner's LAND f6dabfa (land/pres-3, evidence/pres-3 = 42a4bb4),
the push, and the Space deployment of the reviewed bundle 9028a118 as revision 0331088, with
style.css deleted and every file verified. Add the nine post-deployment records from the A6
public checks, including the first HF 429 failure beside its passing retry. The independent
post-deployment review was waived by the Owner for PRES-3 only, on byte identity.

Also: progress.md for the return, landing, deployment and closure; Q&A entries 44-46. The cause
of the non-reproducing hand rebuild (marimo's hidden sandbox prompt) goes to the tooling
follow-up.

Co-Authored-By: Claude Opus 5.5 <noreply@anthropic.com>
</commit_message>
<xml_diff>
--- a/שאלות תשובות.docx
+++ b/שאלות תשובות.docx
@@ -5340,6 +5340,302 @@
           <w:rtl/>
         </w:rPr>
         <w:t xml:space="preserve">כדי שכל אחד יוכל לבדוק אותנו, הדף מחשב מחדש בדפדפן את כל המדדים מהתחזיות שהונפקו בפועל, ומסיים בשורה "תואם לערך השמור". כפתור "אמן בעצמך" מאמן את המודל היומי אצל הגולש ומדווח רק על השוויון שנמדד מול המודל שהנפיק את התחזית.</w:t>
+      </w:r>
+    </w:p>
+    <w:p>
+      <w:pPr>
+        <w:pBdr>
+          <w:bottom w:val="single" w:sz="6" w:space="1" w:color="C8C8C8"/>
+        </w:pBdr>
+        <w:bidi/>
+        <w:spacing w:after="240" w:before="80"/>
+      </w:pPr>
+    </w:p>
+    <w:p>
+      <w:pPr>
+        <w:pStyle w:val="Heading2"/>
+        <w:bidi/>
+        <w:spacing w:after="160" w:before="360"/>
+        <w:jc w:val="right"/>
+      </w:pPr>
+      <w:r>
+        <w:rPr>
+          <w:rFonts w:ascii="Arial" w:cs="Arial" w:eastAsia="Arial" w:hAnsi="Arial"/>
+          <w:color w:val="2A4B7C"/>
+          <w:sz w:val="26"/>
+          <w:szCs w:val="26"/>
+          <w:rtl/>
+        </w:rPr>
+        <w:t xml:space="preserve">44. חבילת הדמו שבניתם מחדש יצאה עם hash שונה מזה שנבדק. איך מצאתם את הסיבה, ומה העליתם בסוף לאוויר?</w:t>
+      </w:r>
+    </w:p>
+    <w:p>
+      <w:pPr>
+        <w:bidi/>
+        <w:spacing w:after="160" w:line="300"/>
+        <w:jc w:val="right"/>
+      </w:pPr>
+      <w:r>
+        <w:rPr>
+          <w:rFonts w:ascii="Arial" w:cs="Arial" w:eastAsia="Arial" w:hAnsi="Arial"/>
+          <w:rtl/>
+        </w:rPr>
+        <w:t xml:space="preserve">זה קרה לנו פעמיים בפרסום של v4, ובשתי הפעמים </w:t>
+      </w:r>
+      <w:r>
+        <w:rPr>
+          <w:rFonts w:ascii="Arial" w:cs="Arial" w:eastAsia="Arial" w:hAnsi="Arial"/>
+          <w:b/>
+          <w:bCs/>
+          <w:rtl/>
+        </w:rPr>
+        <w:t xml:space="preserve">לא העלינו שום דבר שלא נבדק</w:t>
+      </w:r>
+      <w:r>
+        <w:rPr>
+          <w:rFonts w:ascii="Arial" w:cs="Arial" w:eastAsia="Arial" w:hAnsi="Arial"/>
+          <w:rtl/>
+        </w:rPr>
+        <w:t xml:space="preserve">. סקריפט ההעלאה ל-Hugging Face מקבל את ה-hash של החבילה שעברה ביקורת ומסרב לכל חבילה אחרת.</w:t>
+      </w:r>
+    </w:p>
+    <w:p>
+      <w:pPr>
+        <w:bidi/>
+        <w:spacing w:after="160" w:line="300"/>
+        <w:jc w:val="right"/>
+      </w:pPr>
+      <w:r>
+        <w:rPr>
+          <w:rFonts w:ascii="Arial" w:cs="Arial" w:eastAsia="Arial" w:hAnsi="Arial"/>
+          <w:rtl/>
+        </w:rPr>
+        <w:t xml:space="preserve">בפעם הראשונה ה-hash השתנה אף שהמודל לא השתנה. השווינו קובץ מול קובץ ומצאנו שתשעה קבצי מודל שונים בבית אחד בלבד: בית מערכת ההפעלה בכותרת ה-gzip. Python 3.13 כותב שם 255, וה-build הקודם כתב 19. פרסנו את הקבצים, הם זהים ביט לביט, ושער השקילות של הדמו עבר בסטייה 0.0.</w:t>
+      </w:r>
+    </w:p>
+    <w:p>
+      <w:pPr>
+        <w:bidi/>
+        <w:spacing w:after="160" w:line="300"/>
+        <w:jc w:val="right"/>
+      </w:pPr>
+      <w:r>
+        <w:rPr>
+          <w:rFonts w:ascii="Arial" w:cs="Arial" w:eastAsia="Arial" w:hAnsi="Arial"/>
+          <w:rtl/>
+        </w:rPr>
+        <w:t xml:space="preserve">בפעם השנייה, build ידני שהרצנו במסוף רגיל הוציא 566 קבצים במקום 805. </w:t>
+      </w:r>
+      <w:r>
+        <w:rPr>
+          <w:rFonts w:ascii="Arial" w:cs="Arial" w:eastAsia="Arial" w:hAnsi="Arial"/>
+          <w:b/>
+          <w:bCs/>
+          <w:rtl/>
+        </w:rPr>
+        <w:t xml:space="preserve">הסיבה הייתה הנחיה בלתי נראית.</w:t>
+      </w:r>
+      <w:r>
+        <w:rPr>
+          <w:rFonts w:ascii="Arial" w:cs="Arial" w:eastAsia="Arial" w:hAnsi="Arial"/>
+          <w:rtl/>
+        </w:rPr>
+        <w:t xml:space="preserve"> במחברת הדמו יש תלויות inline לפי PEP 723, ו-marimo לא מקובע בהן. כש-marimo רץ במסוף אינטראקטיבי הוא שואל אם להריץ ב-sandbox, ברירת המחדל היא כן, וסקריפט ה-build שלנו לוכד את ה-stderr, כך שהשאלה לא הופיעה. ה-export רץ עם marimo 0.25.0 מסביבה מבודדת חדשה במקום 0.24.2 הנעול. בריצות של הסוכן לא היה TTY, ולכן הבעיה לא הופיעה שם.</w:t>
+      </w:r>
+    </w:p>
+    <w:p>
+      <w:pPr>
+        <w:bidi/>
+        <w:spacing w:after="160" w:line="300"/>
+        <w:jc w:val="right"/>
+      </w:pPr>
+      <w:r>
+        <w:rPr>
+          <w:rFonts w:ascii="Arial" w:cs="Arial" w:eastAsia="Arial" w:hAnsi="Arial"/>
+          <w:rtl/>
+        </w:rPr>
+        <w:t xml:space="preserve">בסוף העלינו את העותק המדויק שנבדק, ואימתנו שכל אחד מ-805 הקבצים המוגשים זהה לחבילה לפי נתיב ו-hash. התיקון הקבוע, להעביר --no-sandbox או לקבע את marimo, עבר לרשימת הכלים. </w:t>
+      </w:r>
+      <w:r>
+        <w:rPr>
+          <w:rFonts w:ascii="Arial" w:cs="Arial" w:eastAsia="Arial" w:hAnsi="Arial"/>
+          <w:b/>
+          <w:bCs/>
+          <w:rtl/>
+        </w:rPr>
+        <w:t xml:space="preserve">הלקח: מעלים את הבייטים שנבדקו, לא בנייה מחודשת שאמורה להיות זהה.</w:t>
+      </w:r>
+    </w:p>
+    <w:p>
+      <w:pPr>
+        <w:pBdr>
+          <w:bottom w:val="single" w:sz="6" w:space="1" w:color="C8C8C8"/>
+        </w:pBdr>
+        <w:bidi/>
+        <w:spacing w:after="240" w:before="80"/>
+      </w:pPr>
+    </w:p>
+    <w:p>
+      <w:pPr>
+        <w:pStyle w:val="Heading2"/>
+        <w:bidi/>
+        <w:spacing w:after="160" w:before="360"/>
+        <w:jc w:val="right"/>
+      </w:pPr>
+      <w:r>
+        <w:rPr>
+          <w:rFonts w:ascii="Arial" w:cs="Arial" w:eastAsia="Arial" w:hAnsi="Arial"/>
+          <w:color w:val="2A4B7C"/>
+          <w:sz w:val="26"/>
+          <w:szCs w:val="26"/>
+          <w:rtl/>
+        </w:rPr>
+        <w:t xml:space="preserve">45. למה צריך גם קורא "טרי" אם כבר יש ביקורת עריכה ומבקר עצמאי?</w:t>
+      </w:r>
+    </w:p>
+    <w:p>
+      <w:pPr>
+        <w:bidi/>
+        <w:spacing w:after="160" w:line="300"/>
+        <w:jc w:val="right"/>
+      </w:pPr>
+      <w:r>
+        <w:rPr>
+          <w:rFonts w:ascii="Arial" w:cs="Arial" w:eastAsia="Arial" w:hAnsi="Arial"/>
+          <w:rtl/>
+        </w:rPr>
+        <w:t xml:space="preserve">כי ידע מעוור. בפרסום של v4 הביקורת העריכתית מצאה חמש הפרות, ותיקנו את כולן. אחר כך נתנו לסוכן בלי שום הקשר רק צילומי מסך של הדף, ושש שאלות קבועות כמו "מה התוצאה המרכזית, ביחס למה, וכמה אנחנו בטוחים".</w:t>
+      </w:r>
+    </w:p>
+    <w:p>
+      <w:pPr>
+        <w:bidi/>
+        <w:spacing w:after="160" w:line="300"/>
+        <w:jc w:val="right"/>
+      </w:pPr>
+      <w:r>
+        <w:rPr>
+          <w:rFonts w:ascii="Arial" w:cs="Arial" w:eastAsia="Arial" w:hAnsi="Arial"/>
+          <w:b/>
+          <w:bCs/>
+          <w:rtl/>
+        </w:rPr>
+        <w:t xml:space="preserve">הקורא הטרי מצא מונח שלא הוגדר בכותרת: policy.</w:t>
+      </w:r>
+      <w:r>
+        <w:rPr>
+          <w:rFonts w:ascii="Arial" w:cs="Arial" w:eastAsia="Arial" w:hAnsi="Arial"/>
+          <w:rtl/>
+        </w:rPr>
+        <w:t xml:space="preserve"> הבודק העריכתי, שמכיר את הפרויקט, קרא אותו בלי לעצור. מי שמגיע מבחוץ נתקע עליו מיד.</w:t>
+      </w:r>
+    </w:p>
+    <w:p>
+      <w:pPr>
+        <w:bidi/>
+        <w:spacing w:after="160" w:line="300"/>
+        <w:jc w:val="right"/>
+      </w:pPr>
+      <w:r>
+        <w:rPr>
+          <w:rFonts w:ascii="Arial" w:cs="Arial" w:eastAsia="Arial" w:hAnsi="Arial"/>
+          <w:rtl/>
+        </w:rPr>
+        <w:t xml:space="preserve">תיקנו את הכותרת, וגרמנו לרשימת המונחים שהכותרת מגדירה לנבוע מהתבנית שלה, באכיפת טסט. מאז, מונח שנכנס לכותרת בלי הגדרה מכשיל את ה-build. אנחנו לא שואלים אם הטקסט נכון, אלא אם מי שלא כתב אותו מבין אותו.</w:t>
+      </w:r>
+    </w:p>
+    <w:p>
+      <w:pPr>
+        <w:pBdr>
+          <w:bottom w:val="single" w:sz="6" w:space="1" w:color="C8C8C8"/>
+        </w:pBdr>
+        <w:bidi/>
+        <w:spacing w:after="240" w:before="80"/>
+      </w:pPr>
+    </w:p>
+    <w:p>
+      <w:pPr>
+        <w:pStyle w:val="Heading2"/>
+        <w:bidi/>
+        <w:spacing w:after="160" w:before="360"/>
+        <w:jc w:val="right"/>
+      </w:pPr>
+      <w:r>
+        <w:rPr>
+          <w:rFonts w:ascii="Arial" w:cs="Arial" w:eastAsia="Arial" w:hAnsi="Arial"/>
+          <w:color w:val="2A4B7C"/>
+          <w:sz w:val="26"/>
+          <w:szCs w:val="26"/>
+          <w:rtl/>
+        </w:rPr>
+        <w:t xml:space="preserve">46. איך מוודאים שסוכן אוטומטי לא כותב לשירות ציבורי יותר ממה שהורשה לו?</w:t>
+      </w:r>
+    </w:p>
+    <w:p>
+      <w:pPr>
+        <w:bidi/>
+        <w:spacing w:after="160" w:line="300"/>
+        <w:jc w:val="right"/>
+      </w:pPr>
+      <w:r>
+        <w:rPr>
+          <w:rFonts w:ascii="Arial" w:cs="Arial" w:eastAsia="Arial" w:hAnsi="Arial"/>
+          <w:rtl/>
+        </w:rPr>
+        <w:t xml:space="preserve">לא סומכים על הכוונות של הסוכן, אלא על </w:t>
+      </w:r>
+      <w:r>
+        <w:rPr>
+          <w:rFonts w:ascii="Arial" w:cs="Arial" w:eastAsia="Arial" w:hAnsi="Arial"/>
+          <w:b/>
+          <w:bCs/>
+          <w:rtl/>
+        </w:rPr>
+        <w:t xml:space="preserve">תוכנית כתיבה שנבדקת לפני הכתיבה</w:t>
+      </w:r>
+      <w:r>
+        <w:rPr>
+          <w:rFonts w:ascii="Arial" w:cs="Arial" w:eastAsia="Arial" w:hAnsi="Arial"/>
+          <w:rtl/>
+        </w:rPr>
+        <w:t xml:space="preserve">. בפרסום של v4 הבריף הרשה לסוכן פעולה חיצונית אחת: להעלות ל-MLflow הציבורי את חמש הריצות של CP-21. כלי ההעלאה קורא קודם את מצב השרת, מחשב בדיוק מה הוא עומד ליצור, ומסרב אם הקבוצה הזו שונה מהקבוצה המורשית.</w:t>
+      </w:r>
+    </w:p>
+    <w:p>
+      <w:pPr>
+        <w:bidi/>
+        <w:spacing w:after="160" w:line="300"/>
+        <w:jc w:val="right"/>
+      </w:pPr>
+      <w:r>
+        <w:rPr>
+          <w:rFonts w:ascii="Arial" w:cs="Arial" w:eastAsia="Arial" w:hAnsi="Arial"/>
+          <w:rtl/>
+        </w:rPr>
+        <w:t xml:space="preserve">בפועל נוצרו חמש ריצות, 23 הריצות שכבר פורסמו נמצאו שלמות ולא נגעו בהן, ולא נכתב שום תג ברמת הניסוי. אחר כך בדקנו את המראה הציבורית: 28 מתוך 28 ריצות תואמות, וכל ה-routes עוברים בשני מנועי דפדפן.</w:t>
+      </w:r>
+    </w:p>
+    <w:p>
+      <w:pPr>
+        <w:bidi/>
+        <w:spacing w:after="160" w:line="300"/>
+        <w:jc w:val="right"/>
+      </w:pPr>
+      <w:r>
+        <w:rPr>
+          <w:rFonts w:ascii="Arial" w:cs="Arial" w:eastAsia="Arial" w:hAnsi="Arial"/>
+          <w:b/>
+          <w:bCs/>
+          <w:rtl/>
+        </w:rPr>
+        <w:t xml:space="preserve">המחיר היה תיאור ניסוי שהתיישן.</w:t>
+      </w:r>
+      <w:r>
+        <w:rPr>
+          <w:rFonts w:ascii="Arial" w:cs="Arial" w:eastAsia="Arial" w:hAnsi="Arial"/>
+          <w:rtl/>
+        </w:rPr>
+        <w:t xml:space="preserve"> תיאור ה-experiment עדיין מונה ארבעה פרויקטים קודמים ולא את CP-21, כי עדכון שלו הוא כתיבה שלא הורשתה. העדפנו תיאור ישן וידוע על פני כתיבה לא מורשית, והעדכון עובר לבריף הפרסום הבא, עם הרשאה מפורשת.</w:t>
       </w:r>
     </w:p>
     <w:sectPr>

</xml_diff>

<commit_message>
docs: close CP-22 (no replacement; v4 kept as it is) with its landing record
The Orchestrator's templates §4 receipt of CP-22's PASS return, the
Owner's decision of 2026-10-04 that v4 stays as it is, the Owner's hand
landing (land/cp-22 = ebb7d42, evidence/cp-22 = 8daf7d0), the reclamation
of gauntlet/cp-22, and the public receipt of the v4 wording fix (b194c72).
progress.md files the Owner's per-block weight idea under 4.8, with its
admissibility rule and a disclosed hindsight bound; Q&A entries 47-51.
Written, committed and pushed on the Owner's explicit instruction of
2026-10-04.

Co-Authored-By: Claude Opus 5.5 <noreply@anthropic.com>
</commit_message>
<xml_diff>
--- a/שאלות תשובות.docx
+++ b/שאלות תשובות.docx
@@ -5636,6 +5636,440 @@
           <w:rtl/>
         </w:rPr>
         <w:t xml:space="preserve"> תיאור ה-experiment עדיין מונה ארבעה פרויקטים קודמים ולא את CP-21, כי עדכון שלו הוא כתיבה שלא הורשתה. העדפנו תיאור ישן וידוע על פני כתיבה לא מורשית, והעדכון עובר לבריף הפרסום הבא, עם הרשאה מפורשת.</w:t>
+      </w:r>
+    </w:p>
+    <w:p>
+      <w:pPr>
+        <w:pBdr>
+          <w:bottom w:val="single" w:sz="6" w:space="1" w:color="C8C8C8"/>
+        </w:pBdr>
+        <w:bidi/>
+        <w:spacing w:after="240" w:before="80"/>
+      </w:pPr>
+    </w:p>
+    <w:p>
+      <w:pPr>
+        <w:pStyle w:val="Heading2"/>
+        <w:bidi/>
+        <w:spacing w:after="160" w:before="360"/>
+        <w:jc w:val="right"/>
+      </w:pPr>
+      <w:r>
+        <w:rPr>
+          <w:rFonts w:ascii="Arial" w:cs="Arial" w:eastAsia="Arial" w:hAnsi="Arial"/>
+          <w:color w:val="2A4B7C"/>
+          <w:sz w:val="26"/>
+          <w:szCs w:val="26"/>
+          <w:rtl/>
+        </w:rPr>
+        <w:t xml:space="preserve">47. בדקתם אם אפשר לפשט את v4 למודל מאוחד אחד, והוא לא היה גרוע בממוצע. למה לא החלפתם?</w:t>
+      </w:r>
+    </w:p>
+    <w:p>
+      <w:pPr>
+        <w:bidi/>
+        <w:spacing w:after="160" w:line="300"/>
+        <w:jc w:val="right"/>
+      </w:pPr>
+      <w:r>
+        <w:rPr>
+          <w:rFonts w:ascii="Arial" w:cs="Arial" w:eastAsia="Arial" w:hAnsi="Arial"/>
+          <w:rtl/>
+        </w:rPr>
+        <w:t xml:space="preserve">ברכיב ה-LightGBM של v4 יש שלושה מודלים נפרדים, אחד לכל בלוק של שעות. רצינו לבדוק אם מודל אחד לכל 24 השעות מספיק, כי השעה ממילא נמצאת בין הפיצ'רים. לפני הריצה קבענו כלל </w:t>
+      </w:r>
+      <w:r>
+        <w:rPr>
+          <w:rFonts w:ascii="Arial" w:cs="Arial" w:eastAsia="Arial" w:hAnsi="Arial"/>
+          <w:b/>
+          <w:bCs/>
+          <w:rtl/>
+        </w:rPr>
+        <w:t xml:space="preserve">non-inferiority</w:t>
+      </w:r>
+      <w:r>
+        <w:rPr>
+          <w:rFonts w:ascii="Arial" w:cs="Arial" w:eastAsia="Arial" w:hAnsi="Arial"/>
+          <w:rtl/>
+        </w:rPr>
+        <w:t xml:space="preserve">: אף ציון לא גרוע באופן מובהק, ששת מבחני הסינון עוברים, ההערכה מלאה, ואף תקופת מבחן לא גרועה באופן מובהק.</w:t>
+      </w:r>
+    </w:p>
+    <w:p>
+      <w:pPr>
+        <w:bidi/>
+        <w:spacing w:after="160" w:line="300"/>
+        <w:jc w:val="right"/>
+      </w:pPr>
+      <w:r>
+        <w:rPr>
+          <w:rFonts w:ascii="Arial" w:cs="Arial" w:eastAsia="Arial" w:hAnsi="Arial"/>
+          <w:rtl/>
+        </w:rPr>
+        <w:t xml:space="preserve">שתי הגרסאות המאוחדות עמדו בשלושת התנאים הראשונים, וההפרש הממוצע מ-v4 היה זניח. שתיהן נכשלו בתנאי הרביעי: בקיץ 2025 הן היו גרועות מ-v4 באופן מובהק, ב-0.2 עד 0.3 EUR/MWh ב-MAE. בפירוק לפי שעות ראינו שבקיץ הזה, עם הרבה סולארי, המודל המאוחד הפסיד כמעט בכל השעות ובעיקר בצהריים, ואילו במשבר 2022 דווקא הוא היה טוב יותר.</w:t>
+      </w:r>
+    </w:p>
+    <w:p>
+      <w:pPr>
+        <w:bidi/>
+        <w:spacing w:after="160" w:line="300"/>
+        <w:jc w:val="right"/>
+      </w:pPr>
+      <w:r>
+        <w:rPr>
+          <w:rFonts w:ascii="Arial" w:cs="Arial" w:eastAsia="Arial" w:hAnsi="Arial"/>
+          <w:rtl/>
+        </w:rPr>
+        <w:t xml:space="preserve">יישמנו את הכלל כמו שנכתב והשארנו את v4. ממוצע על פני חמש תקופות יכול להסתיר הפסד אמיתי במשטר אחד, ובשביל זה התנאי קיים. רצינו מראש להסיר את הפיצול, ובכל זאת </w:t>
+      </w:r>
+      <w:r>
+        <w:rPr>
+          <w:rFonts w:ascii="Arial" w:cs="Arial" w:eastAsia="Arial" w:hAnsi="Arial"/>
+          <w:b/>
+          <w:bCs/>
+          <w:rtl/>
+        </w:rPr>
+        <w:t xml:space="preserve">לא עקפנו את הכלל אחרי שראינו את התוצאות</w:t>
+      </w:r>
+      <w:r>
+        <w:rPr>
+          <w:rFonts w:ascii="Arial" w:cs="Arial" w:eastAsia="Arial" w:hAnsi="Arial"/>
+          <w:rtl/>
+        </w:rPr>
+        <w:t xml:space="preserve">.</w:t>
+      </w:r>
+    </w:p>
+    <w:p>
+      <w:pPr>
+        <w:pBdr>
+          <w:bottom w:val="single" w:sz="6" w:space="1" w:color="C8C8C8"/>
+        </w:pBdr>
+        <w:bidi/>
+        <w:spacing w:after="240" w:before="80"/>
+      </w:pPr>
+    </w:p>
+    <w:p>
+      <w:pPr>
+        <w:pStyle w:val="Heading2"/>
+        <w:bidi/>
+        <w:spacing w:after="160" w:before="360"/>
+        <w:jc w:val="right"/>
+      </w:pPr>
+      <w:r>
+        <w:rPr>
+          <w:rFonts w:ascii="Arial" w:cs="Arial" w:eastAsia="Arial" w:hAnsi="Arial"/>
+          <w:color w:val="2A4B7C"/>
+          <w:sz w:val="26"/>
+          <w:szCs w:val="26"/>
+          <w:rtl/>
+        </w:rPr>
+        <w:t xml:space="preserve">48. בניתם שכבת מרווחים שמגיבה מהר יותר למשברים, והיא אכן הגיבה מהר יותר. למה ויתרתם עליה?</w:t>
+      </w:r>
+    </w:p>
+    <w:p>
+      <w:pPr>
+        <w:bidi/>
+        <w:spacing w:after="160" w:line="300"/>
+        <w:jc w:val="right"/>
+      </w:pPr>
+      <w:r>
+        <w:rPr>
+          <w:rFonts w:ascii="Arial" w:cs="Arial" w:eastAsia="Arial" w:hAnsi="Arial"/>
+          <w:rtl/>
+        </w:rPr>
+        <w:t xml:space="preserve">המרווחים של v3 ו-v4 נלמדים מ-28 הימים האחרונים, כשלכל יום אותו משקל. חששנו שזה איטי מדי בתחילת משבר, ובנינו שכבה דינמית: בתוך החלון ימים חדשים שוקלים יותר, עם זמן מחצית של 7 ימים, ותיקון כיסוי אדפטיבי (ACI) מרחיב את המרווח אחרי יום עם יותר מדי החטאות.</w:t>
+      </w:r>
+    </w:p>
+    <w:p>
+      <w:pPr>
+        <w:bidi/>
+        <w:spacing w:after="160" w:line="300"/>
+        <w:jc w:val="right"/>
+      </w:pPr>
+      <w:r>
+        <w:rPr>
+          <w:rFonts w:ascii="Arial" w:cs="Arial" w:eastAsia="Arial" w:hAnsi="Arial"/>
+          <w:rtl/>
+        </w:rPr>
+        <w:t xml:space="preserve">היא אכן הגיבה מהר יותר. בתחילת שיא אוגוסט 2022 המרווחים התרחבו תוך 4 ימים, לעומת 12 בשכבה הרגילה. אבל לאורך כל התקופה המרווחים יצאו רחבים בכ-15%, והכיסוי עלה רק מ-0.939 ל-0.941. ציון המרווחים (WIS) נעשה גרוע בכ-4.5%, באופן מובהק, גם על v4 וגם על v3.</w:t>
+      </w:r>
+    </w:p>
+    <w:p>
+      <w:pPr>
+        <w:bidi/>
+        <w:spacing w:after="160" w:line="300"/>
+        <w:jc w:val="right"/>
+      </w:pPr>
+      <w:r>
+        <w:rPr>
+          <w:rFonts w:ascii="Arial" w:cs="Arial" w:eastAsia="Arial" w:hAnsi="Arial"/>
+          <w:b/>
+          <w:bCs/>
+          <w:rtl/>
+        </w:rPr>
+        <w:t xml:space="preserve">תגובה מהירה בתחילת משבר נקנית ברעש בכל שאר הזמן</w:t>
+      </w:r>
+      <w:r>
+        <w:rPr>
+          <w:rFonts w:ascii="Arial" w:cs="Arial" w:eastAsia="Arial" w:hAnsi="Arial"/>
+          <w:rtl/>
+        </w:rPr>
+        <w:t xml:space="preserve">, ורוב הזמן אין משבר. ציון המרווחים מעניש רוחב מיותר, אז השארנו את חלון 28 הימים. רכיב מהיר עוד יותר, עם זמן מחצית של יום אחד, לא נבדק בכלל: הכלל הפעיל אותו רק על גרסה מנצחת, וכזו לא הייתה.</w:t>
+      </w:r>
+    </w:p>
+    <w:p>
+      <w:pPr>
+        <w:pBdr>
+          <w:bottom w:val="single" w:sz="6" w:space="1" w:color="C8C8C8"/>
+        </w:pBdr>
+        <w:bidi/>
+        <w:spacing w:after="240" w:before="80"/>
+      </w:pPr>
+    </w:p>
+    <w:p>
+      <w:pPr>
+        <w:pStyle w:val="Heading2"/>
+        <w:bidi/>
+        <w:spacing w:after="160" w:before="360"/>
+        <w:jc w:val="right"/>
+      </w:pPr>
+      <w:r>
+        <w:rPr>
+          <w:rFonts w:ascii="Arial" w:cs="Arial" w:eastAsia="Arial" w:hAnsi="Arial"/>
+          <w:color w:val="2A4B7C"/>
+          <w:sz w:val="26"/>
+          <w:szCs w:val="26"/>
+          <w:rtl/>
+        </w:rPr>
+        <w:t xml:space="preserve">49. איך כיבדתם חריגה מכלל הלוח באמצע ריצה, בלי לגעת בקוד המוקפא?</w:t>
+      </w:r>
+    </w:p>
+    <w:p>
+      <w:pPr>
+        <w:bidi/>
+        <w:spacing w:after="160" w:line="300"/>
+        <w:jc w:val="right"/>
+      </w:pPr>
+      <w:r>
+        <w:rPr>
+          <w:rFonts w:ascii="Arial" w:cs="Arial" w:eastAsia="Arial" w:hAnsi="Arial"/>
+          <w:rtl/>
+        </w:rPr>
+        <w:t xml:space="preserve">יש לנו כלל: אין עבודה מיום שישי 00:00 עד יום ראשון 00:00. בניסוי הזה הכלל נאכף בקוד שמריץ ומודד כל job, והקוד הזה מוקפא: ה-hash שלו רשום בפרוטוקול שנקבע לפני הריצה. שינוי בו היה שובר את בדיקת הפרוטוקול ואת זהות ה-cache, וכל ההתאמות היו נבנות מחדש.</w:t>
+      </w:r>
+    </w:p>
+    <w:p>
+      <w:pPr>
+        <w:bidi/>
+        <w:spacing w:after="160" w:line="300"/>
+        <w:jc w:val="right"/>
+      </w:pPr>
+      <w:r>
+        <w:rPr>
+          <w:rFonts w:ascii="Arial" w:cs="Arial" w:eastAsia="Arial" w:hAnsi="Arial"/>
+          <w:rtl/>
+        </w:rPr>
+        <w:t xml:space="preserve">במוצאי שבת ניתן אישור בכתב לעבוד מיד, ואפילו למחוק את הכלל אם הוא תוקע. את הכלל לא מחקנו. כתבנו </w:t>
+      </w:r>
+      <w:r>
+        <w:rPr>
+          <w:rFonts w:ascii="Arial" w:cs="Arial" w:eastAsia="Arial" w:hAnsi="Arial"/>
+          <w:b/>
+          <w:bCs/>
+          <w:rtl/>
+        </w:rPr>
+        <w:t xml:space="preserve">סקריפט עוטף נפרד</w:t>
+      </w:r>
+      <w:r>
+        <w:rPr>
+          <w:rFonts w:ascii="Arial" w:cs="Arial" w:eastAsia="Arial" w:hAnsi="Arial"/>
+          <w:rtl/>
+        </w:rPr>
+        <w:t xml:space="preserve"> שמריץ את הקוד המוקפא כמו שהוא, עם הבדל אחד: מ-20:33 ועד חצות של אותו לילה, בדיקת הלוח מדווחת 'מחוץ לחלון'. כל שאר המגבלות נשארו, וכל שימוש נרשם ב-ledger יחד עם נוסח האישור.</w:t>
+      </w:r>
+    </w:p>
+    <w:p>
+      <w:pPr>
+        <w:bidi/>
+        <w:spacing w:after="160" w:line="300"/>
+        <w:jc w:val="right"/>
+      </w:pPr>
+      <w:r>
+        <w:rPr>
+          <w:rFonts w:ascii="Arial" w:cs="Arial" w:eastAsia="Arial" w:hAnsi="Arial"/>
+          <w:rtl/>
+        </w:rPr>
+        <w:t xml:space="preserve">בחצות התוקף פג, והכלל חזר לפעול לבד. המבקר העצמאי וידא ש-15 ה-jobs של אותו ערב נשאו את רישום החריגה, ואנחנו בדקנו שהאישור עצמו קיים בכתב. חריגה חד-פעמית נשארה חריגה, ולא הפכה לשינוי כלל.</w:t>
+      </w:r>
+    </w:p>
+    <w:p>
+      <w:pPr>
+        <w:pBdr>
+          <w:bottom w:val="single" w:sz="6" w:space="1" w:color="C8C8C8"/>
+        </w:pBdr>
+        <w:bidi/>
+        <w:spacing w:after="240" w:before="80"/>
+      </w:pPr>
+    </w:p>
+    <w:p>
+      <w:pPr>
+        <w:pStyle w:val="Heading2"/>
+        <w:bidi/>
+        <w:spacing w:after="160" w:before="360"/>
+        <w:jc w:val="right"/>
+      </w:pPr>
+      <w:r>
+        <w:rPr>
+          <w:rFonts w:ascii="Arial" w:cs="Arial" w:eastAsia="Arial" w:hAnsi="Arial"/>
+          <w:color w:val="2A4B7C"/>
+          <w:sz w:val="26"/>
+          <w:szCs w:val="26"/>
+          <w:rtl/>
+        </w:rPr>
+        <w:t xml:space="preserve">50. LightGBM קיבל בדיוק את אותו מידע כמו המודלים הקיימים. אז למה הוספה שלו שיפרה את התחזית?</w:t>
+      </w:r>
+    </w:p>
+    <w:p>
+      <w:pPr>
+        <w:bidi/>
+        <w:spacing w:after="160" w:line="300"/>
+        <w:jc w:val="right"/>
+      </w:pPr>
+      <w:r>
+        <w:rPr>
+          <w:rFonts w:ascii="Arial" w:cs="Arial" w:eastAsia="Arial" w:hAnsi="Arial"/>
+          <w:rtl/>
+        </w:rPr>
+        <w:t xml:space="preserve">כי הוא משתמש באותו מידע בצורה אחרת, ולכן טועה במקומות אחרים. LEAR הוא מודל ליניארי, ולכל פיצ'ר יש בו שיפוע קבוע. מחיר החשמל לא מתנהג כך: עקומת ה-merit order שטוחה ואז תלולה, יש מחירים שליליים בעודף סולארי, והשפעת הרוח תלויה בעומס. עצי החלטה לומדים ספים ואינטראקציות כאלה בעצמם.</w:t>
+      </w:r>
+    </w:p>
+    <w:p>
+      <w:pPr>
+        <w:bidi/>
+        <w:spacing w:after="160" w:line="300"/>
+        <w:jc w:val="right"/>
+      </w:pPr>
+      <w:r>
+        <w:rPr>
+          <w:rFonts w:ascii="Arial" w:cs="Arial" w:eastAsia="Arial" w:hAnsi="Arial"/>
+          <w:rtl/>
+        </w:rPr>
+        <w:t xml:space="preserve">הראיה שהשיפור בא מהשילוב: לבדו, ה-LightGBM לא היה טוב יותר מ-v3. ה-MAE של התחזית המרכזית שלו היה 18.68, מול 17.96 של v3. אבל שליש ממנו בתערובת נתן 17.24, טוב משניהם. </w:t>
+      </w:r>
+      <w:r>
+        <w:rPr>
+          <w:rFonts w:ascii="Arial" w:cs="Arial" w:eastAsia="Arial" w:hAnsi="Arial"/>
+          <w:b/>
+          <w:bCs/>
+          <w:rtl/>
+        </w:rPr>
+        <w:t xml:space="preserve">תערובת מנצחת את שני המרכיבים שלה רק כשהשגיאות שלהם שונות.</w:t>
+      </w:r>
+      <w:r>
+        <w:rPr>
+          <w:rFonts w:ascii="Arial" w:cs="Arial" w:eastAsia="Arial" w:hAnsi="Arial"/>
+          <w:rtl/>
+        </w:rPr>
+        <w:t xml:space="preserve"> המתאם בין השגיאות היה 0.79, וממוצע של שתי תחזיות עם מתאם כזה מקטין את השגיאה בכ-4–5%, כמעט בדיוק השיפור של v4.</w:t>
+      </w:r>
+    </w:p>
+    <w:p>
+      <w:pPr>
+        <w:bidi/>
+        <w:spacing w:after="160" w:line="300"/>
+        <w:jc w:val="right"/>
+      </w:pPr>
+      <w:r>
+        <w:rPr>
+          <w:rFonts w:ascii="Arial" w:cs="Arial" w:eastAsia="Arial" w:hAnsi="Arial"/>
+          <w:rtl/>
+        </w:rPr>
+        <w:t xml:space="preserve">הפיצול לבלוקים של שעות לא מוסיף מידע, אבל משנה את המבנה: מודל מאוחד נאלץ לשתף דפוסים בין שעות. זה פוגע כשהשעות מתנהגות אחרת זו מזו, כמו בקיץ סולארי, ועוזר כשהן זזות יחד, כמו במשבר הגז. ההשפעה תלויה במשטר ובממוצע מתאפסת, ולכן תיקנו את האתר כך שהסיפור של v4 הוא השילוב ולא הבלוקים.</w:t>
+      </w:r>
+    </w:p>
+    <w:p>
+      <w:pPr>
+        <w:pBdr>
+          <w:bottom w:val="single" w:sz="6" w:space="1" w:color="C8C8C8"/>
+        </w:pBdr>
+        <w:bidi/>
+        <w:spacing w:after="240" w:before="80"/>
+      </w:pPr>
+    </w:p>
+    <w:p>
+      <w:pPr>
+        <w:pStyle w:val="Heading2"/>
+        <w:bidi/>
+        <w:spacing w:after="160" w:before="360"/>
+        <w:jc w:val="right"/>
+      </w:pPr>
+      <w:r>
+        <w:rPr>
+          <w:rFonts w:ascii="Arial" w:cs="Arial" w:eastAsia="Arial" w:hAnsi="Arial"/>
+          <w:color w:val="2A4B7C"/>
+          <w:sz w:val="26"/>
+          <w:szCs w:val="26"/>
+          <w:rtl/>
+        </w:rPr>
+        <w:t xml:space="preserve">51. למה לא ללמוד משקל אופטימלי לכל בלוק שעות, או לכל תקופה?</w:t>
+      </w:r>
+    </w:p>
+    <w:p>
+      <w:pPr>
+        <w:bidi/>
+        <w:spacing w:after="160" w:line="300"/>
+        <w:jc w:val="right"/>
+      </w:pPr>
+      <w:r>
+        <w:rPr>
+          <w:rFonts w:ascii="Arial" w:cs="Arial" w:eastAsia="Arial" w:hAnsi="Arial"/>
+          <w:rtl/>
+        </w:rPr>
+        <w:t xml:space="preserve">בדקנו בדיעבד כמה זה היה יכול לתת, כחסם עליון. משקל אחד אופטימלי לכל השעות היה משפר את ה-MAE ב-0.1% בלבד, משקל לכל בלוק ב-0.8%, ומשקל לכל בלוק ולכל תקופה ב-1.6%. הכיוון עקבי: בלילה מגיע ל-LightGBM פחות משקל מאשר ביום, ובמשבר 2022 הרבה פחות בכל הבלוקים, כי עצים לא חוזים מעבר לטווח שראו באימון.</w:t>
+      </w:r>
+    </w:p>
+    <w:p>
+      <w:pPr>
+        <w:bidi/>
+        <w:spacing w:after="160" w:line="300"/>
+        <w:jc w:val="right"/>
+      </w:pPr>
+      <w:r>
+        <w:rPr>
+          <w:rFonts w:ascii="Arial" w:cs="Arial" w:eastAsia="Arial" w:hAnsi="Arial"/>
+          <w:rtl/>
+        </w:rPr>
+        <w:t xml:space="preserve">אבל המספרים האלה הם </w:t>
+      </w:r>
+      <w:r>
+        <w:rPr>
+          <w:rFonts w:ascii="Arial" w:cs="Arial" w:eastAsia="Arial" w:hAnsi="Arial"/>
+          <w:b/>
+          <w:bCs/>
+          <w:rtl/>
+        </w:rPr>
+        <w:t xml:space="preserve">oracle</w:t>
+      </w:r>
+      <w:r>
+        <w:rPr>
+          <w:rFonts w:ascii="Arial" w:cs="Arial" w:eastAsia="Arial" w:hAnsi="Arial"/>
+          <w:rtl/>
+        </w:rPr>
+        <w:t xml:space="preserve">: הם נבחרו אחרי שראינו את התוצאות, ואי אפשר להשתמש בהם. משקל שנבחר לפי התוצאות של אותה תקופה הוא למידה מהעתיד. הגרסה החוקית היא משקל שמתעדכן לאורך הזמן ובכל תחזית מחושב רק משגיאות שכבר שוחררו, או מודל שחוזה את המשקל ומאומן בשיטת walk-forward, רק על העבר, כשהתכנון שלו מוקפא לפני שמחשבים ציונים.</w:t>
+      </w:r>
+    </w:p>
+    <w:p>
+      <w:pPr>
+        <w:bidi/>
+        <w:spacing w:after="160" w:line="300"/>
+        <w:jc w:val="right"/>
+      </w:pPr>
+      <w:r>
+        <w:rPr>
+          <w:rFonts w:ascii="Arial" w:cs="Arial" w:eastAsia="Arial" w:hAnsi="Arial"/>
+          <w:rtl/>
+        </w:rPr>
+        <w:t xml:space="preserve">תייקנו את זה לשלב ה-recombination, אחרי DDNN, כדי ללמוד את המשקלים של כל הרכיבים יחד, פעם אחת. וגם אז, כיוון שכבר ראינו את התקופות האלה, התוצאה תישאר תוצאת פיתוח, והמבחן האמיתי יהיה על נתונים חדשים.</w:t>
       </w:r>
     </w:p>
     <w:sectPr>

</xml_diff>

<commit_message>
docs: close CP-23 (DDNN admitted, v5 not adopted) with its landing record
The Orchestrator's templates §4 receipt of CP-23's PASS return, run with
main's copy of scripts/gauntlet.py; the Owner's hand landing (land/cp-23 =
03c5b64, evidence/cp-23 = 928bc13); the reclamation of gauntlet/cp-23 with
gauntlet.py reclaim; the Owner's two rulings during the run, each caused
by an Orchestrator defect in the anchor or brief and verified in the
Lead's transcript; and the Orchestrator's read-only diagnosis behind the
DDNN-2 proposal. progress.md records the closure and the open decisions
(DDNN-2's timing, publishing the not-adopted branches); Q&A entries 52-54.
Committed and pushed under the Owner's approval of 2026-10-04.

Co-Authored-By: Claude Opus 5.5 <noreply@anthropic.com>
</commit_message>
<xml_diff>
--- a/שאלות תשובות.docx
+++ b/שאלות תשובות.docx
@@ -6070,6 +6070,240 @@
           <w:rtl/>
         </w:rPr>
         <w:t xml:space="preserve">תייקנו את זה לשלב ה-recombination, אחרי DDNN, כדי ללמוד את המשקלים של כל הרכיבים יחד, פעם אחת. וגם אז, כיוון שכבר ראינו את התקופות האלה, התוצאה תישאר תוצאת פיתוח, והמבחן האמיתי יהיה על נתונים חדשים.</w:t>
+      </w:r>
+    </w:p>
+    <w:p>
+      <w:pPr>
+        <w:pBdr>
+          <w:bottom w:val="single" w:sz="6" w:space="1" w:color="C8C8C8"/>
+        </w:pBdr>
+        <w:bidi/>
+        <w:spacing w:after="240" w:before="80"/>
+      </w:pPr>
+    </w:p>
+    <w:p>
+      <w:pPr>
+        <w:pStyle w:val="Heading2"/>
+        <w:bidi/>
+        <w:spacing w:after="160" w:before="360"/>
+        <w:jc w:val="right"/>
+      </w:pPr>
+      <w:r>
+        <w:rPr>
+          <w:rFonts w:ascii="Arial" w:cs="Arial" w:eastAsia="Arial" w:hAnsi="Arial"/>
+          <w:color w:val="2A4B7C"/>
+          <w:sz w:val="26"/>
+          <w:szCs w:val="26"/>
+          <w:rtl/>
+        </w:rPr>
+        <w:t xml:space="preserve">52. תיאור הניסוי הורה לנעול את PyTorch בקובץ ה-lock הראשי, והמהנדס לא עשה את זה. למה?</w:t>
+      </w:r>
+    </w:p>
+    <w:p>
+      <w:pPr>
+        <w:bidi/>
+        <w:spacing w:after="160" w:line="300"/>
+        <w:jc w:val="right"/>
+      </w:pPr>
+      <w:r>
+        <w:rPr>
+          <w:rFonts w:ascii="Arial" w:cs="Arial" w:eastAsia="Arial" w:hAnsi="Arial"/>
+          <w:rtl/>
+        </w:rPr>
+        <w:t xml:space="preserve">כי ה-hash של קובץ ה-lock הראשי (uv.lock) חתום בתוך ראיות של ניסויים קודמים. טסט ה-provenance של CP-10 והפרוטוקול של CP-15 בודקים את ה-SHA-256 שלו, והקוד של CP-16 עד CP-22 מוודא אותו שוב. שינוי של בייט אחד בקובץ הזה היה מפיל את ה-CI, ומבחינה מעשית גם משכתב בדיעבד את הסביבה שעליה נשענות הראיות שכבר נסגרו.</w:t>
+      </w:r>
+    </w:p>
+    <w:p>
+      <w:pPr>
+        <w:bidi/>
+        <w:spacing w:after="160" w:line="300"/>
+        <w:jc w:val="right"/>
+      </w:pPr>
+      <w:r>
+        <w:rPr>
+          <w:rFonts w:ascii="Arial" w:cs="Arial" w:eastAsia="Arial" w:hAnsi="Arial"/>
+          <w:rtl/>
+        </w:rPr>
+        <w:t xml:space="preserve">המהנדס גילה את זה לפני שנגע במשהו, עצר ושאל. הציע שלוש אפשרויות: lock נפרד לבדיקות בלבד, עריכה של הטסט של CP-10, או עצירה עד תיקון העוגן. בחרנו ב-lock נפרד בתיקייה tests/cp23/torch-reference, עם PyTorch בקבוצה שאינה ברירת מחדל ומותקן עם בדיקת hash. PyTorch משמש רק לבדוק את הקוד שכתבנו ב-NumPy, ואף פעם לא מייצר תחזית.</w:t>
+      </w:r>
+    </w:p>
+    <w:p>
+      <w:pPr>
+        <w:bidi/>
+        <w:spacing w:after="160" w:line="300"/>
+        <w:jc w:val="right"/>
+      </w:pPr>
+      <w:r>
+        <w:rPr>
+          <w:rFonts w:ascii="Arial" w:cs="Arial" w:eastAsia="Arial" w:hAnsi="Arial"/>
+          <w:rtl/>
+        </w:rPr>
+        <w:t xml:space="preserve">הטעות הייתה שלנו, בתכנון: כתבנו בעוגן הוראה שסותרת ראיות קיימות. </w:t>
+      </w:r>
+      <w:r>
+        <w:rPr>
+          <w:rFonts w:ascii="Arial" w:cs="Arial" w:eastAsia="Arial" w:hAnsi="Arial"/>
+          <w:b/>
+          <w:bCs/>
+          <w:rtl/>
+        </w:rPr>
+        <w:t xml:space="preserve">הכלל שלמדנו: תלות חדשה של ניסוי נכנסת ל-lock משלו, וה-lock הראשי לא נוגעים בו.</w:t>
+      </w:r>
+    </w:p>
+    <w:p>
+      <w:pPr>
+        <w:pBdr>
+          <w:bottom w:val="single" w:sz="6" w:space="1" w:color="C8C8C8"/>
+        </w:pBdr>
+        <w:bidi/>
+        <w:spacing w:after="240" w:before="80"/>
+      </w:pPr>
+    </w:p>
+    <w:p>
+      <w:pPr>
+        <w:pStyle w:val="Heading2"/>
+        <w:bidi/>
+        <w:spacing w:after="160" w:before="360"/>
+        <w:jc w:val="right"/>
+      </w:pPr>
+      <w:r>
+        <w:rPr>
+          <w:rFonts w:ascii="Arial" w:cs="Arial" w:eastAsia="Arial" w:hAnsi="Arial"/>
+          <w:color w:val="2A4B7C"/>
+          <w:sz w:val="26"/>
+          <w:szCs w:val="26"/>
+          <w:rtl/>
+        </w:rPr>
+        <w:t xml:space="preserve">53. DDNN שיפר את v3 אבל פחות מ-LightGBM, והוספה שלו ל-v4 לא עזרה. מה למדתם מזה?</w:t>
+      </w:r>
+    </w:p>
+    <w:p>
+      <w:pPr>
+        <w:bidi/>
+        <w:spacing w:after="160" w:line="300"/>
+        <w:jc w:val="right"/>
+      </w:pPr>
+      <w:r>
+        <w:rPr>
+          <w:rFonts w:ascii="Arial" w:cs="Arial" w:eastAsia="Arial" w:hAnsi="Arial"/>
+          <w:rtl/>
+        </w:rPr>
+        <w:t xml:space="preserve">בדקנו רשת נוירונים התפלגותית (DDNN) שכתבנו מאפס ב-NumPy, כרכיב שלישי במשקל שליש. היא עברה את כל בדיקות הכניסה, כולל 26 בדיקות התאמה מול PyTorch. אבל לבד היא הייתה החלשה מכל הרכיבים: MAE של 21.2, מול 18.9–19.4 למודלי LEAR בודדים. כרכיב שלישי של v3 היא שיפרה ב-2.5%, חצי ממה ש-LightGBM נתן. ב-v4 היא הורידה את הציון ב-1.2%, ובמשבר 2022 באופן מובהק. לא אימצנו אותה.</w:t>
+      </w:r>
+    </w:p>
+    <w:p>
+      <w:pPr>
+        <w:bidi/>
+        <w:spacing w:after="160" w:line="300"/>
+        <w:jc w:val="right"/>
+      </w:pPr>
+      <w:r>
+        <w:rPr>
+          <w:rFonts w:ascii="Arial" w:cs="Arial" w:eastAsia="Arial" w:hAnsi="Arial"/>
+          <w:rtl/>
+        </w:rPr>
+        <w:t xml:space="preserve">הפירוק הראה למה. השגיאות שלה היו מתואמות 0.83 עם השגיאות של LightGBM. היא קיבלה בדיוק את שורות הפיצ'רים של LightGBM, שורה לכל שעה, ולא את עקומת המחירים היומית המלאה ש-LEAR משתמש בה ושעליה נבנה ה-DDNN בספרות. אז היא למדה להיות LightGBM חלש יותר. ובדיעבד, המשקל הטוב ביותר בשבילה בתוך v4 היה 5–10%, והרווח היה פחות מחצי אחוז.</w:t>
+      </w:r>
+    </w:p>
+    <w:p>
+      <w:pPr>
+        <w:bidi/>
+        <w:spacing w:after="160" w:line="300"/>
+        <w:jc w:val="right"/>
+      </w:pPr>
+      <w:r>
+        <w:rPr>
+          <w:rFonts w:ascii="Arial" w:cs="Arial" w:eastAsia="Arial" w:hAnsi="Arial"/>
+          <w:b/>
+          <w:bCs/>
+          <w:rtl/>
+        </w:rPr>
+        <w:t xml:space="preserve">המסקנה היא לא ש-DDNN לא עובד, אלא שהייצוג קובע.</w:t>
+      </w:r>
+      <w:r>
+        <w:rPr>
+          <w:rFonts w:ascii="Arial" w:cs="Arial" w:eastAsia="Arial" w:hAnsi="Arial"/>
+          <w:rtl/>
+        </w:rPr>
+        <w:t xml:space="preserve"> אותו מידע בייצוג אחר הוא מודל אחר. לכן הצענו DDNN-2 עם ייצוג יומי וחיפוש היפר-פרמטרים אמיתי, שוב בתכנון שנקבע מראש, ולא תיקון של הגרסה הראשונה אחרי שראינו תוצאות.</w:t>
+      </w:r>
+    </w:p>
+    <w:p>
+      <w:pPr>
+        <w:pBdr>
+          <w:bottom w:val="single" w:sz="6" w:space="1" w:color="C8C8C8"/>
+        </w:pBdr>
+        <w:bidi/>
+        <w:spacing w:after="240" w:before="80"/>
+      </w:pPr>
+    </w:p>
+    <w:p>
+      <w:pPr>
+        <w:pStyle w:val="Heading2"/>
+        <w:bidi/>
+        <w:spacing w:after="160" w:before="360"/>
+        <w:jc w:val="right"/>
+      </w:pPr>
+      <w:r>
+        <w:rPr>
+          <w:rFonts w:ascii="Arial" w:cs="Arial" w:eastAsia="Arial" w:hAnsi="Arial"/>
+          <w:color w:val="2A4B7C"/>
+          <w:sz w:val="26"/>
+          <w:szCs w:val="26"/>
+          <w:rtl/>
+        </w:rPr>
+        <w:t xml:space="preserve">54. איך בדיקה עצמאית יכולה לתפוס באג בחישוב הציונים, אם היא מריצה את אותו קוד?</w:t>
+      </w:r>
+    </w:p>
+    <w:p>
+      <w:pPr>
+        <w:bidi/>
+        <w:spacing w:after="160" w:line="300"/>
+        <w:jc w:val="right"/>
+      </w:pPr>
+      <w:r>
+        <w:rPr>
+          <w:rFonts w:ascii="Arial" w:cs="Arial" w:eastAsia="Arial" w:hAnsi="Arial"/>
+          <w:rtl/>
+        </w:rPr>
+        <w:t xml:space="preserve">היא לא אמורה להריץ רק את אותו קוד. ב-CP-23 המבקר העצמאי (ה-Integration Critic) עשה שני דברים. קודם הריץ את מודול הבדיקה של המהנדס, שמחשב מחדש את הציונים מהטבלאות השמורות. אחר כך כתב בעצמו סקריפט ניקוד שני, מתוך הטקסט של העוגן בלבד: ההגדרות של MAE, WIS, הנרמול לפי B0, ה-bootstrap בבלוקים של שבעה ימים, והכלל. הסקריפט לא מייבא שום קוד ניקוד של הפרויקט.</w:t>
+      </w:r>
+    </w:p>
+    <w:p>
+      <w:pPr>
+        <w:bidi/>
+        <w:spacing w:after="160" w:line="300"/>
+        <w:jc w:val="right"/>
+      </w:pPr>
+      <w:r>
+        <w:rPr>
+          <w:rFonts w:ascii="Arial" w:cs="Arial" w:eastAsia="Arial" w:hAnsi="Arial"/>
+          <w:rtl/>
+        </w:rPr>
+        <w:t xml:space="preserve">שני החישובים הסכימו עם הטבלאות שנשמרו עד הפרש של 6e-14, כלומר דיוק נקודה צפה, על כל המדדים, הטווחים וההחלטה. המבקר גם הריץ מחדש את בדיקות ההתאמה מול PyTorch, ושחזר אימון DDNN מייצג והוצאת הקוונטילים שלו.</w:t>
+      </w:r>
+    </w:p>
+    <w:p>
+      <w:pPr>
+        <w:bidi/>
+        <w:spacing w:after="160" w:line="300"/>
+        <w:jc w:val="right"/>
+      </w:pPr>
+      <w:r>
+        <w:rPr>
+          <w:rFonts w:ascii="Arial" w:cs="Arial" w:eastAsia="Arial" w:hAnsi="Arial"/>
+          <w:b/>
+          <w:bCs/>
+          <w:rtl/>
+        </w:rPr>
+        <w:t xml:space="preserve">באג בפירוש של התוכנית היה מופיע גם בקוד וגם בבדיקה שמשתמשת באותו קוד. מימוש שני מאותו טקסט הוא מה שתופס אותו.</w:t>
+      </w:r>
+      <w:r>
+        <w:rPr>
+          <w:rFonts w:ascii="Arial" w:cs="Arial" w:eastAsia="Arial" w:hAnsi="Arial"/>
+          <w:rtl/>
+        </w:rPr>
+        <w:t xml:space="preserve"> הסקריפט של המבקר נשמר בראיות, כך שכל אחד יכול להריץ אותו.</w:t>
       </w:r>
     </w:p>
     <w:sectPr>

</xml_diff>

<commit_message>
docs: close CP-24 (DDNN-2, v5 adopted in research) with its landing record
progress.md: CP-24 closed and v5 recorded as the research base (v4 the
retained comparator); the pause, the Owner's handover, the continuation
(briefs 11063a11… and 5960b908…), the receipt, the LAND (05e6015,
land/cp-24, evidence/cp-24 = 05b7e61) and the reclamation; the v5
publication decisions, CP-24's spent reference passes and the CP-23 lock
binding as open items; the codex planning branch declared.

docs/track-b/cp-24-landing-2026-10-11.md: the landing and closure record.
שאלות תשובות.docx: Q&A entries 55–57.

Co-Authored-By: Claude Opus 5.5 <noreply@anthropic.com>
</commit_message>
<xml_diff>
--- a/שאלות תשובות.docx
+++ b/שאלות תשובות.docx
@@ -6304,6 +6304,277 @@
           <w:rtl/>
         </w:rPr>
         <w:t xml:space="preserve"> הסקריפט של המבקר נשמר בראיות, כך שכל אחד יכול להריץ אותו.</w:t>
+      </w:r>
+    </w:p>
+    <w:p>
+      <w:pPr>
+        <w:pBdr>
+          <w:bottom w:val="single" w:sz="6" w:space="1" w:color="C8C8C8"/>
+        </w:pBdr>
+        <w:bidi/>
+        <w:spacing w:after="240" w:before="80"/>
+      </w:pPr>
+    </w:p>
+    <w:p>
+      <w:pPr>
+        <w:pStyle w:val="Heading2"/>
+        <w:bidi/>
+        <w:spacing w:after="160" w:before="360"/>
+        <w:jc w:val="right"/>
+      </w:pPr>
+      <w:r>
+        <w:rPr>
+          <w:rFonts w:ascii="Arial" w:cs="Arial" w:eastAsia="Arial" w:hAnsi="Arial"/>
+          <w:color w:val="2A4B7C"/>
+          <w:sz w:val="26"/>
+          <w:szCs w:val="26"/>
+          <w:rtl/>
+        </w:rPr>
+        <w:t xml:space="preserve">55. המודל החדש שלכם יצא טוב בכ־11% מהמודל המוביל בכל אחד מחמשת הפולדים. איך ידעתם שזו לא דליפת מידע?</w:t>
+      </w:r>
+    </w:p>
+    <w:p>
+      <w:pPr>
+        <w:bidi/>
+        <w:spacing w:after="160" w:line="300"/>
+        <w:jc w:val="right"/>
+      </w:pPr>
+      <w:r>
+        <w:rPr>
+          <w:rFonts w:ascii="Arial" w:cs="Arial" w:eastAsia="Arial" w:hAnsi="Arial"/>
+          <w:rtl/>
+        </w:rPr>
+        <w:t xml:space="preserve">תוצאה כזאת היא קודם כל חשד. ב־CP-23 רשת ה־DDNN הראשונה שלנו הייתה החבר החלש ביותר באנסמבל. ב־CP-24 הגרסה שבנינו לפי הספרות, DDNN-2, הגיעה לבדה ל־</w:t>
+      </w:r>
+      <w:r>
+        <w:rPr>
+          <w:rFonts w:ascii="Arial" w:cs="Arial" w:eastAsia="Arial" w:hAnsi="Arial"/>
+          <w:b/>
+          <w:bCs/>
+          <w:rtl/>
+        </w:rPr>
+        <w:t xml:space="preserve">10.7% שיפור ב־MAE</w:t>
+      </w:r>
+      <w:r>
+        <w:rPr>
+          <w:rFonts w:ascii="Arial" w:cs="Arial" w:eastAsia="Arial" w:hAnsi="Arial"/>
+          <w:rtl/>
+        </w:rPr>
+        <w:t xml:space="preserve"> מול v4. הבקרות שתוכננו מראש עברו 80 מתוך 80, אבל הן הוכיחו את מסכות הדליפה רק בשתי נקודות תחזית ועל חלק מחברי האנסמבל. דליפה בקבוצת קלט אחרת, בפולד אחר או בנקודת זמן אחרת הייתה עוברת אותן.</w:t>
+      </w:r>
+    </w:p>
+    <w:p>
+      <w:pPr>
+        <w:bidi/>
+        <w:spacing w:after="160" w:line="300"/>
+        <w:jc w:val="right"/>
+      </w:pPr>
+      <w:r>
+        <w:rPr>
+          <w:rFonts w:ascii="Arial" w:cs="Arial" w:eastAsia="Arial" w:hAnsi="Arial"/>
+          <w:rtl/>
+        </w:rPr>
+        <w:t xml:space="preserve">לכן הרחבנו את הבדיקה לכיסוי מלא, כאימות בלבד ובלי לשנות שום דבר מהפרוטוקול הקפוא. בכל 636 נקודות התחזית אימנו מחדש את כל האנסמבל הקפוא, אחרי שהשמדנו כל תוצאה מיום המסירה והלאה. </w:t>
+      </w:r>
+      <w:r>
+        <w:rPr>
+          <w:rFonts w:ascii="Arial" w:cs="Arial" w:eastAsia="Arial" w:hAnsi="Arial"/>
+          <w:b/>
+          <w:bCs/>
+          <w:rtl/>
+        </w:rPr>
+        <w:t xml:space="preserve">כל 636 התחזיות יצאו זהות ביט לביט</w:t>
+      </w:r>
+      <w:r>
+        <w:rPr>
+          <w:rFonts w:ascii="Arial" w:cs="Arial" w:eastAsia="Arial" w:hAnsi="Arial"/>
+          <w:rtl/>
+        </w:rPr>
+        <w:t xml:space="preserve"> לתחזיות שנשמרו.</w:t>
+      </w:r>
+    </w:p>
+    <w:p>
+      <w:pPr>
+        <w:bidi/>
+        <w:spacing w:after="160" w:line="300"/>
+        <w:jc w:val="right"/>
+      </w:pPr>
+      <w:r>
+        <w:rPr>
+          <w:rFonts w:ascii="Arial" w:cs="Arial" w:eastAsia="Arial" w:hAnsi="Arial"/>
+          <w:rtl/>
+        </w:rPr>
+        <w:t xml:space="preserve">בדיקה שלילית שלא יכולה להיכשל לא מוכיחה כלום, אז הוספנו בקרות חיוביות. שינוי במחירי הערב של היום הקודם הזיז את התחזית ב־22 מתוך 22 נקודות. דליפה של יום אחד ששתלנו בכוונה נתפסה בכל חמשת הפולדים. שני מבקרים עצמאיים חזרו על בדיקת השמדת העתיד בנקודות שבחרו בעצמם.</w:t>
+      </w:r>
+    </w:p>
+    <w:p>
+      <w:pPr>
+        <w:bidi/>
+        <w:spacing w:after="160" w:line="300"/>
+        <w:jc w:val="right"/>
+      </w:pPr>
+      <w:r>
+        <w:rPr>
+          <w:rFonts w:ascii="Arial" w:cs="Arial" w:eastAsia="Arial" w:hAnsi="Arial"/>
+          <w:rtl/>
+        </w:rPr>
+        <w:t xml:space="preserve">המסקנה: השיפור אמיתי על הפולדים האלה, אבל הוא עדיין ראיה פיתוחית אחרי בחירה, ההחלטה השנייה על DDNN באותם פולדים. המבחן האמיתי הוא מבחן הנתונים הטריים בסוף התוכנית.</w:t>
+      </w:r>
+    </w:p>
+    <w:p>
+      <w:pPr>
+        <w:pBdr>
+          <w:bottom w:val="single" w:sz="6" w:space="1" w:color="C8C8C8"/>
+        </w:pBdr>
+        <w:bidi/>
+        <w:spacing w:after="240" w:before="80"/>
+      </w:pPr>
+    </w:p>
+    <w:p>
+      <w:pPr>
+        <w:pStyle w:val="Heading2"/>
+        <w:bidi/>
+        <w:spacing w:after="160" w:before="360"/>
+        <w:jc w:val="right"/>
+      </w:pPr>
+      <w:r>
+        <w:rPr>
+          <w:rFonts w:ascii="Arial" w:cs="Arial" w:eastAsia="Arial" w:hAnsi="Arial"/>
+          <w:color w:val="2A4B7C"/>
+          <w:sz w:val="26"/>
+          <w:szCs w:val="26"/>
+          <w:rtl/>
+        </w:rPr>
+        <w:t xml:space="preserve">56. המבקר העצמאי שלכם פסל ריצה שבה המודל דווקא אומץ. למה, ומה עשיתם?</w:t>
+      </w:r>
+    </w:p>
+    <w:p>
+      <w:pPr>
+        <w:bidi/>
+        <w:spacing w:after="160" w:line="300"/>
+        <w:jc w:val="right"/>
+      </w:pPr>
+      <w:r>
+        <w:rPr>
+          <w:rFonts w:ascii="Arial" w:cs="Arial" w:eastAsia="Arial" w:hAnsi="Arial"/>
+          <w:rtl/>
+        </w:rPr>
+        <w:t xml:space="preserve">כלל האימוץ של CP-24 נקבע מראש ברמת ביטחון של </w:t>
+      </w:r>
+      <w:r>
+        <w:rPr>
+          <w:rFonts w:ascii="Arial" w:cs="Arial" w:eastAsia="Arial" w:hAnsi="Arial"/>
+          <w:b/>
+          <w:bCs/>
+          <w:rtl/>
+        </w:rPr>
+        <w:t xml:space="preserve">97.5%</w:t>
+      </w:r>
+      <w:r>
+        <w:rPr>
+          <w:rFonts w:ascii="Arial" w:cs="Arial" w:eastAsia="Arial" w:hAnsi="Arial"/>
+          <w:rtl/>
+        </w:rPr>
+        <w:t xml:space="preserve">, כי זו ההחלטה השנייה על DDNN באותם פולדים. ההחלטה עצמה התקבלה נכון, על ההפרשים בציונים ברמה הזאת. אבל הדוח הציג את השיפור באחוזים רק ברווח 95%. הקורא לא יכול היה לראות את התוצאה ברמה שבה ההחלטה נלקחה, ולכן המבקר כתב FAIL.</w:t>
+      </w:r>
+    </w:p>
+    <w:p>
+      <w:pPr>
+        <w:bidi/>
+        <w:spacing w:after="160" w:line="300"/>
+        <w:jc w:val="right"/>
+      </w:pPr>
+      <w:r>
+        <w:rPr>
+          <w:rFonts w:ascii="Arial" w:cs="Arial" w:eastAsia="Arial" w:hAnsi="Arial"/>
+          <w:rtl/>
+        </w:rPr>
+        <w:t xml:space="preserve">לא חישבנו מחדש שום ציון. גזרנו את רווחי ה־97.5% מדגימות הבוטסטרפ שכבר היו שמורות, בלי לגעת בקבצים הקפואים, והוספנו בדיקה שמוודאת אותם. מבקר רביעי, חדש לגמרי, בדק את המועמד המתוקן ונתן PASS.</w:t>
+      </w:r>
+    </w:p>
+    <w:p>
+      <w:pPr>
+        <w:bidi/>
+        <w:spacing w:after="160" w:line="300"/>
+        <w:jc w:val="right"/>
+      </w:pPr>
+      <w:r>
+        <w:rPr>
+          <w:rFonts w:ascii="Arial" w:cs="Arial" w:eastAsia="Arial" w:hAnsi="Arial"/>
+          <w:rtl/>
+        </w:rPr>
+        <w:t xml:space="preserve">הלקח: רווח הסמך שמוצג חייב להיות ברמה שבה ההחלטה נלקחת. אחרת הדוח מספר סיפור נוח יותר מהכלל שנקבע מראש.</w:t>
+      </w:r>
+    </w:p>
+    <w:p>
+      <w:pPr>
+        <w:pBdr>
+          <w:bottom w:val="single" w:sz="6" w:space="1" w:color="C8C8C8"/>
+        </w:pBdr>
+        <w:bidi/>
+        <w:spacing w:after="240" w:before="80"/>
+      </w:pPr>
+    </w:p>
+    <w:p>
+      <w:pPr>
+        <w:pStyle w:val="Heading2"/>
+        <w:bidi/>
+        <w:spacing w:after="160" w:before="360"/>
+        <w:jc w:val="right"/>
+      </w:pPr>
+      <w:r>
+        <w:rPr>
+          <w:rFonts w:ascii="Arial" w:cs="Arial" w:eastAsia="Arial" w:hAnsi="Arial"/>
+          <w:color w:val="2A4B7C"/>
+          <w:sz w:val="26"/>
+          <w:szCs w:val="26"/>
+          <w:rtl/>
+        </w:rPr>
+        <w:t xml:space="preserve">57. איך בודקים ששלב פיתוח לא שינה אף קובץ קיים, בלי לשבור את הענף הראשי אחר כך?</w:t>
+      </w:r>
+    </w:p>
+    <w:p>
+      <w:pPr>
+        <w:bidi/>
+        <w:spacing w:after="160" w:line="300"/>
+        <w:jc w:val="right"/>
+      </w:pPr>
+      <w:r>
+        <w:rPr>
+          <w:rFonts w:ascii="Arial" w:cs="Arial" w:eastAsia="Arial" w:hAnsi="Arial"/>
+          <w:rtl/>
+        </w:rPr>
+        <w:t xml:space="preserve">הבדיקה הראשונה של CP-24 קיבעה hash לכל 1,322 הקבצים שהיו בריפו בנקודת ההתחלה, כולל מסמכים חיים כמו קובץ ההתקדמות, התוכנית וה־README. על ענף העבודה היא הייתה נכונה. אחרי המיזוג היא הייתה הופכת את ה־CI של main לאדום לצמיתות, כבר בעדכון הראשון של מסמכי הסגירה. תפסנו את זה לפני המיזוג: סימלנו את המיזוג על main העדכני, והבדיקה אכן נכשלה.</w:t>
+      </w:r>
+    </w:p>
+    <w:p>
+      <w:pPr>
+        <w:bidi/>
+        <w:spacing w:after="160" w:line="300"/>
+        <w:jc w:val="right"/>
+      </w:pPr>
+      <w:r>
+        <w:rPr>
+          <w:rFonts w:ascii="Arial" w:cs="Arial" w:eastAsia="Arial" w:hAnsi="Arial"/>
+          <w:rtl/>
+        </w:rPr>
+        <w:t xml:space="preserve">הפרדנו בין שתי שאלות. </w:t>
+      </w:r>
+      <w:r>
+        <w:rPr>
+          <w:rFonts w:ascii="Arial" w:cs="Arial" w:eastAsia="Arial" w:hAnsi="Arial"/>
+          <w:b/>
+          <w:bCs/>
+          <w:rtl/>
+        </w:rPr>
+        <w:t xml:space="preserve">"שום קובץ קיים לא השתנה" היא טענה על קומיט מסוים</w:t>
+      </w:r>
+      <w:r>
+        <w:rPr>
+          <w:rFonts w:ascii="Arial" w:cs="Arial" w:eastAsia="Arial" w:hAnsi="Arial"/>
+          <w:rtl/>
+        </w:rPr>
+        <w:t xml:space="preserve">, ולכן היא נבדקת עכשיו מול אובייקטי Git של המועמד, והתוצאה נשמרת כראיה. בדיקת ה־CI הקבועה בודקת רק את מה שבאמת לא אמור להשתנות לעולם: הרשומה של CP-24 עצמו והבודק. אחרי התיקון המיזוג המדומה על main עבר נקי, עם 1,479 בדיקות.</w:t>
       </w:r>
     </w:p>
     <w:sectPr>

</xml_diff>

<commit_message>
docs: close PRES-4 (v5 published) with its public checks
PRES-4 landed as aebebc1 (land/pres-4; evidence/pres-4 = 80ccc18) and
was pushed by the Owner. The post-deploy receipt passed on all six
surfaces; the browser records passed, with two first failures (HTTP 429
from Hugging Face and DagsHub) kept beside their passing retries. The
Owner waived the independent public review and carried the conditional
rule into stage 4's suspension. Branch and worktree reclaimed after a
verified bundle; stage 2 of the programme plan is done. Q&A 58-60.

Co-Authored-By: Claude Opus 5.5 <noreply@anthropic.com>
</commit_message>
<xml_diff>
--- a/שאלות תשובות.docx
+++ b/שאלות תשובות.docx
@@ -6575,6 +6575,233 @@
           <w:rtl/>
         </w:rPr>
         <w:t xml:space="preserve">, ולכן היא נבדקת עכשיו מול אובייקטי Git של המועמד, והתוצאה נשמרת כראיה. בדיקת ה־CI הקבועה בודקת רק את מה שבאמת לא אמור להשתנות לעולם: הרשומה של CP-24 עצמו והבודק. אחרי התיקון המיזוג המדומה על main עבר נקי, עם 1,479 בדיקות.</w:t>
+      </w:r>
+    </w:p>
+    <w:p>
+      <w:pPr>
+        <w:pBdr>
+          <w:bottom w:val="single" w:sz="6" w:space="1" w:color="C8C8C8"/>
+        </w:pBdr>
+        <w:bidi/>
+        <w:spacing w:after="240" w:before="80"/>
+      </w:pPr>
+    </w:p>
+    <w:p>
+      <w:pPr>
+        <w:pStyle w:val="Heading2"/>
+        <w:bidi/>
+        <w:spacing w:after="160" w:before="360"/>
+        <w:jc w:val="right"/>
+      </w:pPr>
+      <w:r>
+        <w:rPr>
+          <w:rFonts w:ascii="Arial" w:cs="Arial" w:eastAsia="Arial" w:hAnsi="Arial"/>
+          <w:color w:val="2A4B7C"/>
+          <w:sz w:val="26"/>
+          <w:szCs w:val="26"/>
+          <w:rtl/>
+        </w:rPr>
+        <w:t xml:space="preserve">58. כלל האימוץ של CP-24 נכתב אחרי ש־CP-22 ו־CP-23 נכשלו. איך אפשר לסמוך עליו?</w:t>
+      </w:r>
+    </w:p>
+    <w:p>
+      <w:pPr>
+        <w:bidi/>
+        <w:spacing w:after="160" w:line="300"/>
+        <w:jc w:val="right"/>
+      </w:pPr>
+      <w:r>
+        <w:rPr>
+          <w:rFonts w:ascii="Arial" w:cs="Arial" w:eastAsia="Arial" w:hAnsi="Arial"/>
+          <w:rtl/>
+        </w:rPr>
+        <w:t xml:space="preserve">נכון, וזה כתוב בעוגן עצמו. הכלל cp24-adoption נקבע ב־5 באוקטובר 2026, יום אחרי ש־CP-22 ו־CP-23 נסגרו בלי אימוץ. כל מי שהיה מעורב ידע את התוצאות הקודמות על אותם חמישה פולדים, והעיצוב של DDNN-2 נבע בחלקו מהאבחנה של CP-23 ברמת הפולד. לא הסתרנו את זה, אלא גילינו את זה מראש.</w:t>
+      </w:r>
+    </w:p>
+    <w:p>
+      <w:pPr>
+        <w:bidi/>
+        <w:spacing w:after="160" w:line="300"/>
+        <w:jc w:val="right"/>
+      </w:pPr>
+      <w:r>
+        <w:rPr>
+          <w:rFonts w:ascii="Arial" w:cs="Arial" w:eastAsia="Arial" w:hAnsi="Arial"/>
+          <w:rtl/>
+        </w:rPr>
+        <w:t xml:space="preserve">מה שהכלל לא ידע הוא שום תוצאה של DDNN-2: הוא נקבע לפני ש־DDNN-2 אומן אפילו פעם אחת. והוא </w:t>
+      </w:r>
+      <w:r>
+        <w:rPr>
+          <w:rFonts w:ascii="Arial" w:cs="Arial" w:eastAsia="Arial" w:hAnsi="Arial"/>
+          <w:b/>
+          <w:bCs/>
+          <w:rtl/>
+        </w:rPr>
+        <w:t xml:space="preserve">מחמיר</w:t>
+      </w:r>
+      <w:r>
+        <w:rPr>
+          <w:rFonts w:ascii="Arial" w:cs="Arial" w:eastAsia="Arial" w:hAnsi="Arial"/>
+          <w:rtl/>
+        </w:rPr>
+        <w:t xml:space="preserve"> יותר מהכלל של CP-23, לא מקל. תנאי השיפור נבדק ברווח 97.5% במקום 95%, כדי לחלק את ה־5% בין שני ניסיונות אפשריים, ונוסף תנאי של שיפור מעשי של לפחות 0.5% בשני הציונים. הוא הופעל מכנית, בלי לשנות שום סף אחרי התוצאות.</w:t>
+      </w:r>
+    </w:p>
+    <w:p>
+      <w:pPr>
+        <w:bidi/>
+        <w:spacing w:after="160" w:line="300"/>
+        <w:jc w:val="right"/>
+      </w:pPr>
+      <w:r>
+        <w:rPr>
+          <w:rFonts w:ascii="Arial" w:cs="Arial" w:eastAsia="Arial" w:hAnsi="Arial"/>
+          <w:rtl/>
+        </w:rPr>
+        <w:t xml:space="preserve">ובגלל זה בדיוק לא קראנו לתוצאה הוכחה. היא מסווגת כראיה פיתוחית אחרי בחירה, ההחלטה השנייה על DDNN באותם פולדים, ו־v1 נשאר המוצר. ההגנה האמיתית היא </w:t>
+      </w:r>
+      <w:r>
+        <w:rPr>
+          <w:rFonts w:ascii="Arial" w:cs="Arial" w:eastAsia="Arial" w:hAnsi="Arial"/>
+          <w:b/>
+          <w:bCs/>
+          <w:rtl/>
+        </w:rPr>
+        <w:t xml:space="preserve">4.7T</w:t>
+      </w:r>
+      <w:r>
+        <w:rPr>
+          <w:rFonts w:ascii="Arial" w:cs="Arial" w:eastAsia="Arial" w:hAnsi="Arial"/>
+          <w:rtl/>
+        </w:rPr>
+        <w:t xml:space="preserve">: תשעים ימים אחרי 7 באפריל 2026 שאף אחד לא ראה, שייפתחו פעם אחת, עם המועמד, הכלל ומודל הייחוס קבועים לפני כן.</w:t>
+      </w:r>
+    </w:p>
+    <w:p>
+      <w:pPr>
+        <w:pBdr>
+          <w:bottom w:val="single" w:sz="6" w:space="1" w:color="C8C8C8"/>
+        </w:pBdr>
+        <w:bidi/>
+        <w:spacing w:after="240" w:before="80"/>
+      </w:pPr>
+    </w:p>
+    <w:p>
+      <w:pPr>
+        <w:pStyle w:val="Heading2"/>
+        <w:bidi/>
+        <w:spacing w:after="160" w:before="360"/>
+        <w:jc w:val="right"/>
+      </w:pPr>
+      <w:r>
+        <w:rPr>
+          <w:rFonts w:ascii="Arial" w:cs="Arial" w:eastAsia="Arial" w:hAnsi="Arial"/>
+          <w:color w:val="2A4B7C"/>
+          <w:sz w:val="26"/>
+          <w:szCs w:val="26"/>
+          <w:rtl/>
+        </w:rPr>
+        <w:t xml:space="preserve">59. מה תפס הסוקר העצמאי בפרסום של v5, ולמה התיקון היה יותר מתיקון של שורה אחת?</w:t>
+      </w:r>
+    </w:p>
+    <w:p>
+      <w:pPr>
+        <w:bidi/>
+        <w:spacing w:after="160" w:line="300"/>
+        <w:jc w:val="right"/>
+      </w:pPr>
+      <w:r>
+        <w:rPr>
+          <w:rFonts w:ascii="Arial" w:cs="Arial" w:eastAsia="Arial" w:hAnsi="Arial"/>
+          <w:rtl/>
+        </w:rPr>
+        <w:t xml:space="preserve">הסקירה העצמאית הראשונה נתנה FAIL על באג שקט. בטבלת היחסים המדויקים של v5, עמודות רווחי הסמך הציגו את ערך הנקודה המעוגל במקום הגבולות. הסיבה: שכבת הטענות קיבלה אפשרות תצוגה שלא הכירה, ובמקום להיכשל חזרה בשקט לברירת המחדל, ערך הנקודה. הטבלה נראתה תקינה לגמרי.</w:t>
+      </w:r>
+    </w:p>
+    <w:p>
+      <w:pPr>
+        <w:bidi/>
+        <w:spacing w:after="160" w:line="300"/>
+        <w:jc w:val="right"/>
+      </w:pPr>
+      <w:r>
+        <w:rPr>
+          <w:rFonts w:ascii="Arial" w:cs="Arial" w:eastAsia="Arial" w:hAnsi="Arial"/>
+          <w:rtl/>
+        </w:rPr>
+        <w:t xml:space="preserve">תיקנו את הטבלה, אבל העיקר היה לשנות את ההתנהגות: אפשרות לא מוכרת </w:t>
+      </w:r>
+      <w:r>
+        <w:rPr>
+          <w:rFonts w:ascii="Arial" w:cs="Arial" w:eastAsia="Arial" w:hAnsi="Arial"/>
+          <w:b/>
+          <w:bCs/>
+          <w:rtl/>
+        </w:rPr>
+        <w:t xml:space="preserve">נדחית עכשיו עם שגיאה</w:t>
+      </w:r>
+      <w:r>
+        <w:rPr>
+          <w:rFonts w:ascii="Arial" w:cs="Arial" w:eastAsia="Arial" w:hAnsi="Arial"/>
+          <w:rtl/>
+        </w:rPr>
+        <w:t xml:space="preserve">, והוספנו בדיקות ובקרה שלילית שמוודאות שהיא אכן נדחית. בשכבה שמייצרת מספרים לפרסום, ברירת מחדל שקטה גרועה מקריסה: קריסה עוצרת את הבנייה, ומספר שגוי יוצא לציבור.</w:t>
+      </w:r>
+    </w:p>
+    <w:p>
+      <w:pPr>
+        <w:pBdr>
+          <w:bottom w:val="single" w:sz="6" w:space="1" w:color="C8C8C8"/>
+        </w:pBdr>
+        <w:bidi/>
+        <w:spacing w:after="240" w:before="80"/>
+      </w:pPr>
+    </w:p>
+    <w:p>
+      <w:pPr>
+        <w:pStyle w:val="Heading2"/>
+        <w:bidi/>
+        <w:spacing w:after="160" w:before="360"/>
+        <w:jc w:val="right"/>
+      </w:pPr>
+      <w:r>
+        <w:rPr>
+          <w:rFonts w:ascii="Arial" w:cs="Arial" w:eastAsia="Arial" w:hAnsi="Arial"/>
+          <w:color w:val="2A4B7C"/>
+          <w:sz w:val="26"/>
+          <w:szCs w:val="26"/>
+          <w:rtl/>
+        </w:rPr>
+        <w:t xml:space="preserve">60. איך מפרסמים דור חדש של מודל בלי לשנות בטעות מספר שכבר פורסם?</w:t>
+      </w:r>
+    </w:p>
+    <w:p>
+      <w:pPr>
+        <w:bidi/>
+        <w:spacing w:after="160" w:line="300"/>
+        <w:jc w:val="right"/>
+      </w:pPr>
+      <w:r>
+        <w:rPr>
+          <w:rFonts w:ascii="Arial" w:cs="Arial" w:eastAsia="Arial" w:hAnsi="Arial"/>
+          <w:rtl/>
+        </w:rPr>
+        <w:t xml:space="preserve">כל דור חדש מגיע עם ניסוי חדש, ולכן אותה שורה בטבלת ההשוואה, למשל v3 או v4, נמצאת ביותר מניסוי אחד. בפרסום של v5 כל שורה נלקחת מהניסוי החדש ביותר שמכיל אותה, ושומר בבנייה בודק שהשורה זהה בבתים בכל הניסויים שמכילים אותה. אם שני ניסויים לא מסכימים על אותה שורה, הבנייה מסרבת לרוץ.</w:t>
+      </w:r>
+    </w:p>
+    <w:p>
+      <w:pPr>
+        <w:bidi/>
+        <w:spacing w:after="160" w:line="300"/>
+        <w:jc w:val="right"/>
+      </w:pPr>
+      <w:r>
+        <w:rPr>
+          <w:rFonts w:ascii="Arial" w:cs="Arial" w:eastAsia="Arial" w:hAnsi="Arial"/>
+          <w:rtl/>
+        </w:rPr>
+        <w:t xml:space="preserve">בנוסף נעלנו את הגרף של cp21 ב־MLflow לגרסה שכבר פורסמה, והבדיקות מוודאות שמקטע המוצר והפרקים של v1 עד v4 זהים בבתים לעמוד שפורסם לפני כן. כך הפרסום של v5 הוסיף תוכן, ולא שינה אף רשומה שכבר הייתה ציבורית.</w:t>
       </w:r>
     </w:p>
     <w:sectPr>

</xml_diff>

<commit_message>
docs: Stage 3 source research, and the Owner's vintage standard
The research agent's report (78 products, none passing all five filters
without conditions) and Elia's bounded coverage counts, checked against
the primary pages. Wind and solar stay on our own GFS model; CP-25's
conditional list is recorded. The Owner set a three-tier vintage
standard for data admission and sent no enquiries. Programme plan
stage 3 done; Q&A 61.

Co-Authored-By: Claude Opus 5.5 <noreply@anthropic.com>
</commit_message>
<xml_diff>
--- a/שאלות תשובות.docx
+++ b/שאלות תשובות.docx
@@ -6802,6 +6802,84 @@
           <w:rtl/>
         </w:rPr>
         <w:t xml:space="preserve">בנוסף נעלנו את הגרף של cp21 ב־MLflow לגרסה שכבר פורסמה, והבדיקות מוודאות שמקטע המוצר והפרקים של v1 עד v4 זהים בבתים לעמוד שפורסם לפני כן. כך הפרסום של v5 הוסיף תוכן, ולא שינה אף רשומה שכבר הייתה ציבורית.</w:t>
+      </w:r>
+    </w:p>
+    <w:p>
+      <w:pPr>
+        <w:pBdr>
+          <w:bottom w:val="single" w:sz="6" w:space="1" w:color="C8C8C8"/>
+        </w:pBdr>
+        <w:bidi/>
+        <w:spacing w:after="240" w:before="80"/>
+      </w:pPr>
+    </w:p>
+    <w:p>
+      <w:pPr>
+        <w:pStyle w:val="Heading2"/>
+        <w:bidi/>
+        <w:spacing w:after="160" w:before="360"/>
+        <w:jc w:val="right"/>
+      </w:pPr>
+      <w:r>
+        <w:rPr>
+          <w:rFonts w:ascii="Arial" w:cs="Arial" w:eastAsia="Arial" w:hAnsi="Arial"/>
+          <w:color w:val="2A4B7C"/>
+          <w:sz w:val="26"/>
+          <w:szCs w:val="26"/>
+          <w:rtl/>
+        </w:rPr>
+        <w:t xml:space="preserve">61. איך החלטתם אילו מקורות נתונים חיצוניים מותר להכניס לבדיקה ההיסטורית של התחזית?</w:t>
+      </w:r>
+    </w:p>
+    <w:p>
+      <w:pPr>
+        <w:bidi/>
+        <w:spacing w:after="160" w:line="300"/>
+        <w:jc w:val="right"/>
+      </w:pPr>
+      <w:r>
+        <w:rPr>
+          <w:rFonts w:ascii="Arial" w:cs="Arial" w:eastAsia="Arial" w:hAnsi="Arial"/>
+          <w:rtl/>
+        </w:rPr>
+        <w:t xml:space="preserve">חיפשנו כל מקור חינמי וחוקי: מחירי דלק ופחמן, מחירים באזורים השכנים, קיבולות חוצות גבולות, תחזיות רוח ושמש מוקדמות, ריביות ומדדי תנודתיות. כל מוצר נבחן בחמישה מסננים: חינם, רישיון שמתאים לריפו ציבורי, פרסום לפני שעת התחזית, היסטוריה מ־2019 כפי שפורסמה אז, ונתיב יומי חוקי למוצר החי. מתוך 78 מוצרים, אף אחד לא עבר את כל החמישה בלי תנאים.</w:t>
+      </w:r>
+    </w:p>
+    <w:p>
+      <w:pPr>
+        <w:bidi/>
+        <w:spacing w:after="160" w:line="300"/>
+        <w:jc w:val="right"/>
+      </w:pPr>
+      <w:r>
+        <w:rPr>
+          <w:rFonts w:ascii="Arial" w:cs="Arial" w:eastAsia="Arial" w:hAnsi="Arial"/>
+          <w:rtl/>
+        </w:rPr>
+        <w:t xml:space="preserve">הלקח המרכזי היה ההבדל בין זמן חישוב לזמן פרסום. מפעילי רשת בגרמניה מחשבים את תחזית הרוח ב־08:00 או 09:00, אבל מפרסמים אותה רק ב־18:00, אחרי המכרז. גם טבלה היסטורית פתוחה לא מוכיחה כלום: רוב המקורות מציגים את הגרסה המתוקנת האחרונה, לא את מה שהיה ידוע ביום. לכן את תחזיות הרוח והשמש לגרמניה נבנה בעצמנו מהרצות GFS המקוריות.</w:t>
+      </w:r>
+    </w:p>
+    <w:p>
+      <w:pPr>
+        <w:bidi/>
+        <w:spacing w:after="160" w:line="300"/>
+        <w:jc w:val="right"/>
+      </w:pPr>
+      <w:r>
+        <w:rPr>
+          <w:rFonts w:ascii="Arial" w:cs="Arial" w:eastAsia="Arial" w:hAnsi="Arial"/>
+          <w:rtl/>
+        </w:rPr>
+        <w:t xml:space="preserve">קבענו תקן בשלוש דרגות. גרסאות מקוריות עם חותמת זמן פרסום נכנסות להערכה הראשית. ערכים מקוריים שנשמרו, עם זמן זמינות ששוחזר מלוח פרסום מתועד, יכולים להיכנס עם גילוי נאות ובדיקת רגישות לעיכוב. היסטוריה מתוקנת בלי גרסאות מקוריות נבדקת בנפרד בלבד. </w:t>
+      </w:r>
+      <w:r>
+        <w:rPr>
+          <w:rFonts w:ascii="Arial" w:cs="Arial" w:eastAsia="Arial" w:hAnsi="Arial"/>
+          <w:b/>
+          <w:bCs/>
+          <w:rtl/>
+        </w:rPr>
+        <w:t xml:space="preserve">מותר לשחזר מתי ערך היה זמין; אסור להחליף אותו בערך שתוקן בדיעבד.</w:t>
       </w:r>
     </w:p>
     <w:sectPr>

</xml_diff>

<commit_message>
docs: Stage 4 methodology memo, and the Owner's protocol decisions
The research agent's memo (protocol skeleton, pitfalls, 37 references)
and the Owner's decisions on it: the issue time becomes D-1 11:00
Europe/Berlin, one hour before the gate, all year; CP-28 pre-registers
the plan's arms (DDNN-2 alone, equal and learned weights, per-block
weights, the NumPy meta-learner); CP-27 may admit several sources, with
one union arm. Records the brief's DDNN-2 correction and the agent's
red-line disclosure. Q&A 62-63.

Co-Authored-By: Claude Opus 5.5 <noreply@anthropic.com>
</commit_message>
<xml_diff>
--- a/שאלות תשובות.docx
+++ b/שאלות תשובות.docx
@@ -6880,6 +6880,148 @@
           <w:rtl/>
         </w:rPr>
         <w:t xml:space="preserve">מותר לשחזר מתי ערך היה זמין; אסור להחליף אותו בערך שתוקן בדיעבד.</w:t>
+      </w:r>
+    </w:p>
+    <w:p>
+      <w:pPr>
+        <w:pBdr>
+          <w:bottom w:val="single" w:sz="6" w:space="1" w:color="C8C8C8"/>
+        </w:pBdr>
+        <w:bidi/>
+        <w:spacing w:after="240" w:before="80"/>
+      </w:pPr>
+    </w:p>
+    <w:p>
+      <w:pPr>
+        <w:pStyle w:val="Heading2"/>
+        <w:bidi/>
+        <w:spacing w:after="160" w:before="360"/>
+        <w:jc w:val="right"/>
+      </w:pPr>
+      <w:r>
+        <w:rPr>
+          <w:rFonts w:ascii="Arial" w:cs="Arial" w:eastAsia="Arial" w:hAnsi="Arial"/>
+          <w:color w:val="2A4B7C"/>
+          <w:sz w:val="26"/>
+          <w:szCs w:val="26"/>
+          <w:rtl/>
+        </w:rPr>
+        <w:t xml:space="preserve">62. התחזית שלכם הונפקה ב־11:00 UTC. האם זו באמת הייתה תחזית לפני המכרז?</w:t>
+      </w:r>
+    </w:p>
+    <w:p>
+      <w:pPr>
+        <w:bidi/>
+        <w:spacing w:after="160" w:line="300"/>
+        <w:jc w:val="right"/>
+      </w:pPr>
+      <w:r>
+        <w:rPr>
+          <w:rFonts w:ascii="Arial" w:cs="Arial" w:eastAsia="Arial" w:hAnsi="Arial"/>
+          <w:rtl/>
+        </w:rPr>
+        <w:t xml:space="preserve">בחורף, 11:00 UTC היא בדיוק 12:00, שעת סגירת המכרז. בקיץ היא 13:00, שעה אחרי הסגירה ואחרי שהתוצאות כבר פורסמו. המודלים שלנו מעולם לא השתמשו במחיר של יום היעד, ולכן התוצאות לא דלפו. אבל מוצר חי שמפרסם בשעה הזאת בקיץ היה "חוזה" מחירים שכבר ידועים.</w:t>
+      </w:r>
+    </w:p>
+    <w:p>
+      <w:pPr>
+        <w:bidi/>
+        <w:spacing w:after="160" w:line="300"/>
+        <w:jc w:val="right"/>
+      </w:pPr>
+      <w:r>
+        <w:rPr>
+          <w:rFonts w:ascii="Arial" w:cs="Arial" w:eastAsia="Arial" w:hAnsi="Arial"/>
+          <w:rtl/>
+        </w:rPr>
+        <w:t xml:space="preserve">גילינו את זה כשתכננו את פרוטוקול ההערכה החדש. מחקר המתודולוגיה הצביע על הפער, ובדקנו בעוגן שהשעה הוגדרה בהיסט קבוע של UTC+1, בלי כלל לשעון קיץ. החלטנו לעבור ל־</w:t>
+      </w:r>
+      <w:r>
+        <w:rPr>
+          <w:rFonts w:ascii="Arial" w:cs="Arial" w:eastAsia="Arial" w:hAnsi="Arial"/>
+          <w:b/>
+          <w:bCs/>
+          <w:rtl/>
+        </w:rPr>
+        <w:t xml:space="preserve">11:00 שעון ברלין כל השנה</w:t>
+      </w:r>
+      <w:r>
+        <w:rPr>
+          <w:rFonts w:ascii="Arial" w:cs="Arial" w:eastAsia="Arial" w:hAnsi="Arial"/>
+          <w:rtl/>
+        </w:rPr>
+        <w:t xml:space="preserve">, שעה לפני סגירת המכרז, וכל קלט חייב להתפרסם לפני כן. הרשומות הישנות נשארות כפי שהן, וכל קלט ייבדק מחדש מול השעה החדשה.</w:t>
+      </w:r>
+    </w:p>
+    <w:p>
+      <w:pPr>
+        <w:pBdr>
+          <w:bottom w:val="single" w:sz="6" w:space="1" w:color="C8C8C8"/>
+        </w:pBdr>
+        <w:bidi/>
+        <w:spacing w:after="240" w:before="80"/>
+      </w:pPr>
+    </w:p>
+    <w:p>
+      <w:pPr>
+        <w:pStyle w:val="Heading2"/>
+        <w:bidi/>
+        <w:spacing w:after="160" w:before="360"/>
+        <w:jc w:val="right"/>
+      </w:pPr>
+      <w:r>
+        <w:rPr>
+          <w:rFonts w:ascii="Arial" w:cs="Arial" w:eastAsia="Arial" w:hAnsi="Arial"/>
+          <w:color w:val="2A4B7C"/>
+          <w:sz w:val="26"/>
+          <w:szCs w:val="26"/>
+          <w:rtl/>
+        </w:rPr>
+        <w:t xml:space="preserve">63. אם בודקים מחדש את המודלים הישנים על כל 1,926 הימים, זה לא מבחן חדש ובלתי תלוי?</w:t>
+      </w:r>
+    </w:p>
+    <w:p>
+      <w:pPr>
+        <w:bidi/>
+        <w:spacing w:after="160" w:line="300"/>
+        <w:jc w:val="right"/>
+      </w:pPr>
+      <w:r>
+        <w:rPr>
+          <w:rFonts w:ascii="Arial" w:cs="Arial" w:eastAsia="Arial" w:hAnsi="Arial"/>
+          <w:rtl/>
+        </w:rPr>
+        <w:t xml:space="preserve">לא. ימים שלא נבדקו קודם מרחיבים את הכיסוי, אבל המודלים נבחרו על נתונים מאותה תקופה, על ידי אנשים שכבר ראו תוצאות. לכן הכל נשאר ראיה פיתוחית אחרי בחירה. כדי שההשוואה תהיה הוגנת, קובעים מראש את כל המועמדים, את סף השיפור ואת התיקון להשוואות מרובות, ומסתכלים פעם אחת בלבד.</w:t>
+      </w:r>
+    </w:p>
+    <w:p>
+      <w:pPr>
+        <w:bidi/>
+        <w:spacing w:after="160" w:line="300"/>
+        <w:jc w:val="right"/>
+      </w:pPr>
+      <w:r>
+        <w:rPr>
+          <w:rFonts w:ascii="Arial" w:cs="Arial" w:eastAsia="Arial" w:hAnsi="Arial"/>
+          <w:rtl/>
+        </w:rPr>
+        <w:t xml:space="preserve">המבחן האמיתי הוא </w:t>
+      </w:r>
+      <w:r>
+        <w:rPr>
+          <w:rFonts w:ascii="Arial" w:cs="Arial" w:eastAsia="Arial" w:hAnsi="Arial"/>
+          <w:b/>
+          <w:bCs/>
+          <w:rtl/>
+        </w:rPr>
+        <w:t xml:space="preserve">90 הימים שאחרי 7 באפריל 2026</w:t>
+      </w:r>
+      <w:r>
+        <w:rPr>
+          <w:rFonts w:ascii="Arial" w:cs="Arial" w:eastAsia="Arial" w:hAnsi="Arial"/>
+          <w:rtl/>
+        </w:rPr>
+        <w:t xml:space="preserve">, שאף אחד לא ראה. מועמד אחד מוקפא לפני כן, והחלון נפתח פעם אחת. גם תוצאה אפסית היא תוצאה לגיטימית.</w:t>
       </w:r>
     </w:p>
     <w:sectPr>

</xml_diff>

<commit_message>
docs: close CP-25 with its landing record and the Owner's rulings
CP-25 landed as 5336aef (land/cp-25; evidence/cp-25 = ba4e130). The
Owner's tier and margin rulings under v21-r13 §24.5: a recorded
exception for the tier-3 load forecast plus a descriptive "v5 (no load
forecast)" check (CP-26's ceiling 485 machine-hours); prices tier 2;
the structural shifts accepted as disclosed risks; the two late GFS runs
treated under §15.3. The exposure ledger's entries 1-5 are assessed,
none blocking. Branch and worktree reclaimed after a verified bundle;
three documentation errata carried in the landing record. Q&A 64-65.

Co-Authored-By: Claude Opus 5.5 <noreply@anthropic.com>
</commit_message>
<xml_diff>
--- a/שאלות תשובות.docx
+++ b/שאלות תשובות.docx
@@ -7022,6 +7022,148 @@
           <w:rtl/>
         </w:rPr>
         <w:t xml:space="preserve">, שאף אחד לא ראה. מועמד אחד מוקפא לפני כן, והחלון נפתח פעם אחת. גם תוצאה אפסית היא תוצאה לגיטימית.</w:t>
+      </w:r>
+    </w:p>
+    <w:p>
+      <w:pPr>
+        <w:pBdr>
+          <w:bottom w:val="single" w:sz="6" w:space="1" w:color="C8C8C8"/>
+        </w:pBdr>
+        <w:bidi/>
+        <w:spacing w:after="240" w:before="80"/>
+      </w:pPr>
+    </w:p>
+    <w:p>
+      <w:pPr>
+        <w:pStyle w:val="Heading2"/>
+        <w:bidi/>
+        <w:spacing w:after="160" w:before="360"/>
+        <w:jc w:val="right"/>
+      </w:pPr>
+      <w:r>
+        <w:rPr>
+          <w:rFonts w:ascii="Arial" w:cs="Arial" w:eastAsia="Arial" w:hAnsi="Arial"/>
+          <w:color w:val="2A4B7C"/>
+          <w:sz w:val="26"/>
+          <w:szCs w:val="26"/>
+          <w:rtl/>
+        </w:rPr>
+        <w:t xml:space="preserve">64. תחזית העומס מתפרסמת לפני המכרז. למה סיווגתם את ההיסטוריה שלה כלא אמינה, ומה עשיתם עם זה?</w:t>
+      </w:r>
+    </w:p>
+    <w:p>
+      <w:pPr>
+        <w:bidi/>
+        <w:spacing w:after="160" w:line="300"/>
+        <w:jc w:val="right"/>
+      </w:pPr>
+      <w:r>
+        <w:rPr>
+          <w:rFonts w:ascii="Arial" w:cs="Arial" w:eastAsia="Arial" w:hAnsi="Arial"/>
+          <w:rtl/>
+        </w:rPr>
+        <w:t xml:space="preserve">התחזית חייבת להתפרסם עד 10:00 שעון ברלין, שעה לפני שעת ההנפקה שלנו, אז במוצר החי היא באמת זמינה. אבל הרגולציה האירופית מחייבת לעדכן אותה כשיש שינוי משמעותי, ו־SMARD מגדיר את זה כשינוי של 10% ומעלה. הנתונים ההיסטוריים שבידינו הם הגרסה הנוכחית בלי גרסאות קודמות, ולכן אי אפשר להוכיח שזה מה שהיה ידוע בבוקר של כל יום. לפי התקן שקבענו, זו דרגה 3.</w:t>
+      </w:r>
+    </w:p>
+    <w:p>
+      <w:pPr>
+        <w:bidi/>
+        <w:spacing w:after="160" w:line="300"/>
+        <w:jc w:val="right"/>
+      </w:pPr>
+      <w:r>
+        <w:rPr>
+          <w:rFonts w:ascii="Arial" w:cs="Arial" w:eastAsia="Arial" w:hAnsi="Arial"/>
+          <w:rtl/>
+        </w:rPr>
+        <w:t xml:space="preserve">לא זרקנו את הקלט, כי במוצר החי הוא לגיטימי לגמרי. נתנו לו </w:t>
+      </w:r>
+      <w:r>
+        <w:rPr>
+          <w:rFonts w:ascii="Arial" w:cs="Arial" w:eastAsia="Arial" w:hAnsi="Arial"/>
+          <w:b/>
+          <w:bCs/>
+          <w:rtl/>
+        </w:rPr>
+        <w:t xml:space="preserve">חריגה מתועדת</w:t>
+      </w:r>
+      <w:r>
+        <w:rPr>
+          <w:rFonts w:ascii="Arial" w:cs="Arial" w:eastAsia="Arial" w:hAnsi="Arial"/>
+          <w:rtl/>
+        </w:rPr>
+        <w:t xml:space="preserve"> בהערכה הראשית, והוספנו גרסה תיאורית של v5 בלי תחזית העומס בכלל. ההפרש בין שתיהן חוסם מלמעלה כמה התוצאות יכולות להיות אופטימיות בגלל עדכונים בדיעבד.</w:t>
+      </w:r>
+    </w:p>
+    <w:p>
+      <w:pPr>
+        <w:pBdr>
+          <w:bottom w:val="single" w:sz="6" w:space="1" w:color="C8C8C8"/>
+        </w:pBdr>
+        <w:bidi/>
+        <w:spacing w:after="240" w:before="80"/>
+      </w:pPr>
+    </w:p>
+    <w:p>
+      <w:pPr>
+        <w:pStyle w:val="Heading2"/>
+        <w:bidi/>
+        <w:spacing w:after="160" w:before="360"/>
+        <w:jc w:val="right"/>
+      </w:pPr>
+      <w:r>
+        <w:rPr>
+          <w:rFonts w:ascii="Arial" w:cs="Arial" w:eastAsia="Arial" w:hAnsi="Arial"/>
+          <w:color w:val="2A4B7C"/>
+          <w:sz w:val="26"/>
+          <w:szCs w:val="26"/>
+          <w:rtl/>
+        </w:rPr>
+        <w:t xml:space="preserve">65. איך יודעים מתי תחזית מזג אוויר היסטורית הייתה באמת זמינה?</w:t>
+      </w:r>
+    </w:p>
+    <w:p>
+      <w:pPr>
+        <w:bidi/>
+        <w:spacing w:after="160" w:line="300"/>
+        <w:jc w:val="right"/>
+      </w:pPr>
+      <w:r>
+        <w:rPr>
+          <w:rFonts w:ascii="Arial" w:cs="Arial" w:eastAsia="Arial" w:hAnsi="Arial"/>
+          <w:rtl/>
+        </w:rPr>
+        <w:t xml:space="preserve">ל־GFS יש לוח פרסום מתועד: הריצה של חצות UTC מוכנה בערך ב־04:00 UTC. זה נותן זמינות משוחזרת, כלומר דרגה 2. בנוסף בדקנו לכל אחת מ־329 הריצות החדשות את זמן הכתיבה של הקבצים בארכיון של AWS, כראיה ברמת הריצה הבודדת.</w:t>
+      </w:r>
+    </w:p>
+    <w:p>
+      <w:pPr>
+        <w:bidi/>
+        <w:spacing w:after="160" w:line="300"/>
+        <w:jc w:val="right"/>
+      </w:pPr>
+      <w:r>
+        <w:rPr>
+          <w:rFonts w:ascii="Arial" w:cs="Arial" w:eastAsia="Arial" w:hAnsi="Arial"/>
+          <w:rtl/>
+        </w:rPr>
+        <w:t xml:space="preserve">ב־327 ריצות הקבצים נכתבו הרבה לפני שעת ההנפקה. בשתיים הם נכתבו אחריה. זמן כתיבה לא מבחין בין ריצה שאיחרה לבין העלאה מחדש, אז לא הייתה דרך לדעת. בחרנו בזהירות: </w:t>
+      </w:r>
+      <w:r>
+        <w:rPr>
+          <w:rFonts w:ascii="Arial" w:cs="Arial" w:eastAsia="Arial" w:hAnsi="Arial"/>
+          <w:b/>
+          <w:bCs/>
+          <w:rtl/>
+        </w:rPr>
+        <w:t xml:space="preserve">שתי הריצות טופלו כמאחרות</w:t>
+      </w:r>
+      <w:r>
+        <w:rPr>
+          <w:rFonts w:ascii="Arial" w:cs="Arial" w:eastAsia="Arial" w:hAnsi="Arial"/>
+          <w:rtl/>
+        </w:rPr>
+        <w:t xml:space="preserve">, ומזג האוויר בשני הימים האלה הושלם מחציון של נתוני האימון. זה כמעט לא עולה כלום, ומוריד שאלה מהביקורת שלפני המבחן הסופי.</w:t>
       </w:r>
     </w:p>
     <w:sectPr>

</xml_diff>

<commit_message>
docs: close CP-26 with its landing record and the omitted-files manifest
The landing record (identities, the curated landing, three landing-repair
rounds, results, the Owner's decisions, disclosures and reclamation), the
exclusion rule and the 9,419-file omitted manifest; progress, the
programme plan (the Owner's order after CP-26, 4.7T's 90 days), the
exposure ledger, and Q&A 66-68 with the 4.7T date corrected in two
earlier answers.

Co-Authored-By: Claude Opus 5.5 <noreply@anthropic.com>
</commit_message>
<xml_diff>
--- a/שאלות תשובות.docx
+++ b/שאלות תשובות.docx
@@ -6675,7 +6675,7 @@
           <w:rFonts w:ascii="Arial" w:cs="Arial" w:eastAsia="Arial" w:hAnsi="Arial"/>
           <w:rtl/>
         </w:rPr>
-        <w:t xml:space="preserve">: תשעים ימים אחרי 7 באפריל 2026 שאף אחד לא ראה, שייפתחו פעם אחת, עם המועמד, הכלל ומודל הייחוס קבועים לפני כן.</w:t>
+        <w:t xml:space="preserve">: תשעים ימים אחרי 6 בספטמבר 2026 שאף אחד לא ראה, שייפתחו פעם אחת, עם המועמד, הכלל ומודל הייחוס קבועים לפני כן.</w:t>
       </w:r>
     </w:p>
     <w:p>
@@ -7014,7 +7014,7 @@
           <w:bCs/>
           <w:rtl/>
         </w:rPr>
-        <w:t xml:space="preserve">90 הימים שאחרי 7 באפריל 2026</w:t>
+        <w:t xml:space="preserve">90 הימים שאחרי 6 בספטמבר 2026</w:t>
       </w:r>
       <w:r>
         <w:rPr>
@@ -7164,6 +7164,158 @@
           <w:rtl/>
         </w:rPr>
         <w:t xml:space="preserve">, ומזג האוויר בשני הימים האלה הושלם מחציון של נתוני האימון. זה כמעט לא עולה כלום, ומוריד שאלה מהביקורת שלפני המבחן הסופי.</w:t>
+      </w:r>
+    </w:p>
+    <w:p>
+      <w:pPr>
+        <w:pStyle w:val="Heading2"/>
+        <w:bidi/>
+        <w:spacing w:after="160" w:before="360"/>
+        <w:jc w:val="right"/>
+      </w:pPr>
+      <w:r>
+        <w:rPr>
+          <w:rFonts w:ascii="Arial" w:cs="Arial" w:eastAsia="Arial" w:hAnsi="Arial"/>
+          <w:color w:val="2A4B7C"/>
+          <w:sz w:val="26"/>
+          <w:szCs w:val="26"/>
+          <w:rtl/>
+        </w:rPr>
+        <w:t xml:space="preserve">66. למה לא העליתם ל־GitHub את כל מה שהריצה יצרה?</w:t>
+      </w:r>
+    </w:p>
+    <w:p>
+      <w:pPr>
+        <w:bidi/>
+        <w:spacing w:after="160" w:line="300"/>
+        <w:jc w:val="right"/>
+      </w:pPr>
+      <w:r>
+        <w:rPr>
+          <w:rFonts w:ascii="Arial" w:cs="Arial" w:eastAsia="Arial" w:hAnsi="Arial"/>
+          <w:rtl/>
+        </w:rPr>
+        <w:t xml:space="preserve">הריצה יצרה 10,350 קבצים, 3.4 GB. אחד מהם, מצב השחזור של הריצה, שוקל 357 MB, ו־GitHub דוחה כל קובץ מעל 100 MB. העלינו 931 קבצים, 45.6 MB: הקוד, הבדיקות, הדוח, המניפסטים והראיות. כל אחד מהם זהה בייט לבייט לגרסה שנבדקה.</w:t>
+      </w:r>
+    </w:p>
+    <w:p>
+      <w:pPr>
+        <w:bidi/>
+        <w:spacing w:after="160" w:line="300"/>
+        <w:jc w:val="right"/>
+      </w:pPr>
+      <w:r>
+        <w:rPr>
+          <w:rFonts w:ascii="Arial" w:cs="Arial" w:eastAsia="Arial" w:hAnsi="Arial"/>
+          <w:rtl/>
+        </w:rPr>
+        <w:t xml:space="preserve">9,419 הקבצים הכבדים, ובהם יומן התחזיות שהשלב הבא קורא, נשארו בתג ראיות מקומי ובחבילת git שנבדקה בשחזור מלא. לריפו נכנסה רשימה של כולם, עם הגודל ומזהה ה־Git של כל קובץ, כך שכל קובץ שהושמט אפשר לאמת מול הרשימה ולשחזר מהחבילה.</w:t>
+      </w:r>
+    </w:p>
+    <w:p>
+      <w:pPr>
+        <w:pStyle w:val="Heading2"/>
+        <w:bidi/>
+        <w:spacing w:after="160" w:before="360"/>
+        <w:jc w:val="right"/>
+      </w:pPr>
+      <w:r>
+        <w:rPr>
+          <w:rFonts w:ascii="Arial" w:cs="Arial" w:eastAsia="Arial" w:hAnsi="Arial"/>
+          <w:color w:val="2A4B7C"/>
+          <w:sz w:val="26"/>
+          <w:szCs w:val="26"/>
+          <w:rtl/>
+        </w:rPr>
+        <w:t xml:space="preserve">67. איך מוודאים שבדיקות שעוברות על המחשב שלכם יעברו גם ב־CI?</w:t>
+      </w:r>
+    </w:p>
+    <w:p>
+      <w:pPr>
+        <w:bidi/>
+        <w:spacing w:after="160" w:line="300"/>
+        <w:jc w:val="right"/>
+      </w:pPr>
+      <w:r>
+        <w:rPr>
+          <w:rFonts w:ascii="Arial" w:cs="Arial" w:eastAsia="Arial" w:hAnsi="Arial"/>
+          <w:rtl/>
+        </w:rPr>
+        <w:t xml:space="preserve">לפני הנחיתה הרצנו את ה־CI כמו ש־GitHub מריץ אותו: commit אחד בלי היסטוריה, Python 3.12 וסביבה נקייה. זה חשף בדיקות שנשענו על היסטוריית ה־Git של הענף, שלא קיימת אחרי squash, וציפיות שנשארו מגרסאות קודמות של העוגן. תיקנו אותן כך שיקראו זהויות מתועדות עם hash נעול.</w:t>
+      </w:r>
+    </w:p>
+    <w:p>
+      <w:pPr>
+        <w:bidi/>
+        <w:spacing w:after="160" w:line="300"/>
+        <w:jc w:val="right"/>
+      </w:pPr>
+      <w:r>
+        <w:rPr>
+          <w:rFonts w:ascii="Arial" w:cs="Arial" w:eastAsia="Arial" w:hAnsi="Arial"/>
+          <w:rtl/>
+        </w:rPr>
+        <w:t xml:space="preserve">בדיקת עומס אחת, שלושה תהליכים שמעסיקים את המעבד ועוד משימה רביעית, עברה על מחשב שקט ונכשלה 5 מתוך 5 כשתפסנו ארבע ליבות כדי לדמות את המכונה של GitHub, שיש לה 4 ליבות. היו לזה שתי סיבות: הבדיקה חיכתה רק 15 שניות, ושני ספים של 0.5 שניות נשארו מגרסה שבה זו הייתה מגבלת הנעילה של המערכת. הכיול העלה את המגבלה אחר כך ל־3 שניות.</w:t>
+      </w:r>
+    </w:p>
+    <w:p>
+      <w:pPr>
+        <w:bidi/>
+        <w:spacing w:after="160" w:line="300"/>
+        <w:jc w:val="right"/>
+      </w:pPr>
+      <w:r>
+        <w:rPr>
+          <w:rFonts w:ascii="Arial" w:cs="Arial" w:eastAsia="Arial" w:hAnsi="Arial"/>
+          <w:rtl/>
+        </w:rPr>
+        <w:t xml:space="preserve">תיקנו רק את הבדיקה: זמני המתנה ארוכים יותר, והספים קשורים לקבוע המכויל. אחרי זה היא עברה 10 מתוך 10 גם עם שש ליבות תפוסות. ובכל זאת, לפני ש־main זז, דחפנו קודם לענף זמני כדי לראות CI ירוק על מכונה אמיתית.</w:t>
+      </w:r>
+    </w:p>
+    <w:p>
+      <w:pPr>
+        <w:pStyle w:val="Heading2"/>
+        <w:bidi/>
+        <w:spacing w:after="160" w:before="360"/>
+        <w:jc w:val="right"/>
+      </w:pPr>
+      <w:r>
+        <w:rPr>
+          <w:rFonts w:ascii="Arial" w:cs="Arial" w:eastAsia="Arial" w:hAnsi="Arial"/>
+          <w:color w:val="2A4B7C"/>
+          <w:sz w:val="26"/>
+          <w:szCs w:val="26"/>
+          <w:rtl/>
+        </w:rPr>
+        <w:t xml:space="preserve">68. מה גילתה ההערכה מחדש על כל הימים?</w:t>
+      </w:r>
+    </w:p>
+    <w:p>
+      <w:pPr>
+        <w:bidi/>
+        <w:spacing w:after="160" w:line="300"/>
+        <w:jc w:val="right"/>
+      </w:pPr>
+      <w:r>
+        <w:rPr>
+          <w:rFonts w:ascii="Arial" w:cs="Arial" w:eastAsia="Arial" w:hAnsi="Arial"/>
+          <w:rtl/>
+        </w:rPr>
+        <w:t xml:space="preserve">על 2,068 ימים, מסוף 2020 עד ספטמבר 2026, v5 ו־v4 יצאו כמעט שווים: MAE של 18.5 מול 18.6, ו־WIS של 10.9 לשניהם. השיפור של כ־2.5% ש־v5 הראה על חמשת הפולדים לא החזיק על כל הלוח.</w:t>
+      </w:r>
+    </w:p>
+    <w:p>
+      <w:pPr>
+        <w:bidi/>
+        <w:spacing w:after="160" w:line="300"/>
+        <w:jc w:val="right"/>
+      </w:pPr>
+      <w:r>
+        <w:rPr>
+          <w:rFonts w:ascii="Arial" w:cs="Arial" w:eastAsia="Arial" w:hAnsi="Arial"/>
+          <w:rtl/>
+        </w:rPr>
+        <w:t xml:space="preserve">DDNN-2 לבדו היה הטוב ביותר, 17.2 ו־9.7. זו תוצאה תיאורית: השלב הבא בודק אותו, יחד עם שש דרכים לשלב מודלים, לפי כללים שנרשמו מראש. ריצה שבה תחזית מזג האוויר מגיעה באיחור של שש שעות הייתה גרועה בכ־15%, ורשמנו את זה כסיכון תפעולי. הכל נשאר ראיה פיתוחית אחרי בחירה, וההגנה היא מבחן 90 הימים הטריים.</w:t>
       </w:r>
     </w:p>
     <w:sectPr>

</xml_diff>

<commit_message>
docs: close CP-28 with its landing record; the Owner's decisions before CP-17
The landing record (identities, the receipt, the GitHub check, the LAND the
Orchestrator executed on the Owner's instruction, the results, disclosures
and reclamation); progress; the programme plan's CP-28 row and the list of
the Owner's decisions before CP-17, with recommendations; Q&A 69.

Co-Authored-By: Claude Opus 5.5 <noreply@anthropic.com>
</commit_message>
<xml_diff>
--- a/שאלות תשובות.docx
+++ b/שאלות תשובות.docx
@@ -7316,6 +7316,66 @@
           <w:rtl/>
         </w:rPr>
         <w:t xml:space="preserve">DDNN-2 לבדו היה הטוב ביותר, 17.2 ו־9.7. זו תוצאה תיאורית: השלב הבא בודק אותו, יחד עם שש דרכים לשלב מודלים, לפי כללים שנרשמו מראש. ריצה שבה תחזית מזג האוויר מגיעה באיחור של שש שעות הייתה גרועה בכ־15%, ורשמנו את זה כסיכון תפעולי. הכל נשאר ראיה פיתוחית אחרי בחירה, וההגנה היא מבחן 90 הימים הטריים.</w:t>
+      </w:r>
+    </w:p>
+    <w:p>
+      <w:pPr>
+        <w:pStyle w:val="Heading2"/>
+        <w:bidi/>
+        <w:spacing w:after="160" w:before="360"/>
+        <w:jc w:val="right"/>
+      </w:pPr>
+      <w:r>
+        <w:rPr>
+          <w:rFonts w:ascii="Arial" w:cs="Arial" w:eastAsia="Arial" w:hAnsi="Arial"/>
+          <w:color w:val="2A4B7C"/>
+          <w:sz w:val="26"/>
+          <w:szCs w:val="26"/>
+          <w:rtl/>
+        </w:rPr>
+        <w:t xml:space="preserve">69. למה המודל הסופי הוא DDNN-2 לבדו, ולא שילוב של כמה מודלים?</w:t>
+      </w:r>
+    </w:p>
+    <w:p>
+      <w:pPr>
+        <w:bidi/>
+        <w:spacing w:after="160" w:line="300"/>
+        <w:jc w:val="right"/>
+      </w:pPr>
+      <w:r>
+        <w:rPr>
+          <w:rFonts w:ascii="Arial" w:cs="Arial" w:eastAsia="Arial" w:hAnsi="Arial"/>
+          <w:rtl/>
+        </w:rPr>
+        <w:t xml:space="preserve">רשמנו מראש שבע דרכים לשלב את שלושת המודלים: משקלים קבועים, משקלים שנלמדים מהעבר, משקלים לכל בלוק שעות, ורשת קטנה שבוחרת משקלים לפי מצב השוק. כל אחת מהן למדה רק מימים קודמים, וכל השבע נבחנו פעם אחת, מול v5, על 2,068 ימים.</w:t>
+      </w:r>
+    </w:p>
+    <w:p>
+      <w:pPr>
+        <w:bidi/>
+        <w:spacing w:after="160" w:line="300"/>
+        <w:jc w:val="right"/>
+      </w:pPr>
+      <w:r>
+        <w:rPr>
+          <w:rFonts w:ascii="Arial" w:cs="Arial" w:eastAsia="Arial" w:hAnsi="Arial"/>
+          <w:rtl/>
+        </w:rPr>
+        <w:t xml:space="preserve">כל השבע עברו את התנאים מול v5, אבל ל־DDNN-2 לבדו הייתה שגיאת המרווחים הנמוכה ביותר: WIS של 9.68 מול 10.87 של v5, כלומר 10.9% פחות, ו־MAE נמוך ב־6.9%. הוא היה טוב יותר בכל שנה ובכל עונה. גם בתיקו, כלל הבחירה מעדיף את המודל הפשוט.</w:t>
+      </w:r>
+    </w:p>
+    <w:p>
+      <w:pPr>
+        <w:bidi/>
+        <w:spacing w:after="160" w:line="300"/>
+        <w:jc w:val="right"/>
+      </w:pPr>
+      <w:r>
+        <w:rPr>
+          <w:rFonts w:ascii="Arial" w:cs="Arial" w:eastAsia="Arial" w:hAnsi="Arial"/>
+          <w:rtl/>
+        </w:rPr>
+        <w:t xml:space="preserve">זו עדיין ראיה פיתוחית אחרי בחירה: DDNN-2 לבדו כבר הופיע בדוח הקודם. ההגנה היא מבחן 90 הימים הטריים, שבו המודל המוקפא נבחן פעם אחת על ימים שאף אחד לא ראה.</w:t>
       </w:r>
     </w:p>
     <w:sectPr>

</xml_diff>

<commit_message>
docs: close CP-17b with its landing record
The landing record. It gives the identities and the Lead handover,
done mid-checkpoint on the Owner's instruction. It also covers the
receipt, the history-free CI and GitHub check (run 40812216265), and the
LAND, which the Orchestrator executed on the Owner's "Yes, run the
LAND". The rest of the record is what the re-freeze established, the
terms and hazard for r18, the open items, disclosures and reclamation.
It also adds one open item that the return omitted: a malformed
issued-forecasts day raises instead of being listed (it fails closed).

Progress: CP-17b closed; next, r18. Q&A entries 70-73.

Co-Authored-By: Claude Opus 5.5 <noreply@anthropic.com>
</commit_message>
<xml_diff>
--- a/שאלות תשובות.docx
+++ b/שאלות תשובות.docx
@@ -7376,6 +7376,304 @@
           <w:rtl/>
         </w:rPr>
         <w:t xml:space="preserve">זו עדיין ראיה פיתוחית אחרי בחירה: DDNN-2 לבדו כבר הופיע בדוח הקודם. ההגנה היא מבחן 90 הימים הטריים, שבו המודל המוקפא נבחן פעם אחת על ימים שאף אחד לא ראה.</w:t>
+      </w:r>
+    </w:p>
+    <w:p>
+      <w:pPr>
+        <w:pBdr>
+          <w:bottom w:val="single" w:sz="6" w:space="1" w:color="C8C8C8"/>
+        </w:pBdr>
+        <w:bidi/>
+        <w:spacing w:after="240" w:before="80"/>
+      </w:pPr>
+    </w:p>
+    <w:p>
+      <w:pPr>
+        <w:pStyle w:val="Heading2"/>
+        <w:bidi/>
+        <w:spacing w:after="160" w:before="360"/>
+        <w:jc w:val="right"/>
+      </w:pPr>
+      <w:r>
+        <w:rPr>
+          <w:rFonts w:ascii="Arial" w:cs="Arial" w:eastAsia="Arial" w:hAnsi="Arial"/>
+          <w:color w:val="2A4B7C"/>
+          <w:sz w:val="26"/>
+          <w:szCs w:val="26"/>
+          <w:rtl/>
+        </w:rPr>
+        <w:t xml:space="preserve">70. איך מוודאים שתיקון של מסמך מדיניות לא שובר את ה-CI של מודל מוקפא?</w:t>
+      </w:r>
+    </w:p>
+    <w:p>
+      <w:pPr>
+        <w:bidi/>
+        <w:spacing w:after="160" w:line="300"/>
+        <w:jc w:val="right"/>
+      </w:pPr>
+      <w:r>
+        <w:rPr>
+          <w:rFonts w:ascii="Arial" w:cs="Arial" w:eastAsia="Arial" w:hAnsi="Arial"/>
+          <w:rtl/>
+        </w:rPr>
+        <w:t xml:space="preserve">ההקפאה שלנו נעלה לפי hash גם את קוד המודל וגם מסמכי ממשל: מסמך העוגן ורשומת ההחלטות. ידענו שתיקון העוגן הבא ישבור את הבדיקה, ולכן העברנו את מסמכי הממשל לעותקים קפואים בתוך תיק הראיות. הקלטים החישוביים, הקוד וסביבות הריצה נשארו נבדקים חיים.</w:t>
+      </w:r>
+    </w:p>
+    <w:p>
+      <w:pPr>
+        <w:bidi/>
+        <w:spacing w:after="160" w:line="300"/>
+        <w:jc w:val="right"/>
+      </w:pPr>
+      <w:r>
+        <w:rPr>
+          <w:rFonts w:ascii="Arial" w:cs="Arial" w:eastAsia="Arial" w:hAnsi="Arial"/>
+          <w:rtl/>
+        </w:rPr>
+        <w:t xml:space="preserve">הבודק העצמאי הראשון עדיין הפיל את הסבב. בדיקה ישנה של ההקפאה הקודמת, שהוחלפה אבל עדיין רצה, קראה את העוגן החי. מצאנו את זה רק כי הרצנו CI על עותק נקי, עם תיקון מדומה של העוגן ורשומת החלטות חדשה.</w:t>
+      </w:r>
+    </w:p>
+    <w:p>
+      <w:pPr>
+        <w:bidi/>
+        <w:spacing w:after="160" w:line="300"/>
+        <w:jc w:val="right"/>
+      </w:pPr>
+      <w:r>
+        <w:rPr>
+          <w:rFonts w:ascii="Arial" w:cs="Arial" w:eastAsia="Arial" w:hAnsi="Arial"/>
+          <w:rtl/>
+        </w:rPr>
+        <w:t xml:space="preserve">התיקון: הבדיקה הישנה מקבלת תצוגה שבה מסמכי הממשל באים מהעותקים הקפואים, וכל השאר נשאר נעול חי. </w:t>
+      </w:r>
+      <w:r>
+        <w:rPr>
+          <w:rFonts w:ascii="Arial" w:cs="Arial" w:eastAsia="Arial" w:hAnsi="Arial"/>
+          <w:b/>
+          <w:bCs/>
+          <w:rtl/>
+        </w:rPr>
+        <w:t xml:space="preserve">הלקח: כדי לדעת שמשהו שורד שינוי, מדמים את השינוי ומריצים, לא קוראים את הקוד.</w:t>
+      </w:r>
+    </w:p>
+    <w:p>
+      <w:pPr>
+        <w:pBdr>
+          <w:bottom w:val="single" w:sz="6" w:space="1" w:color="C8C8C8"/>
+        </w:pBdr>
+        <w:bidi/>
+        <w:spacing w:after="240" w:before="80"/>
+      </w:pPr>
+    </w:p>
+    <w:p>
+      <w:pPr>
+        <w:pStyle w:val="Heading2"/>
+        <w:bidi/>
+        <w:spacing w:after="160" w:before="360"/>
+        <w:jc w:val="right"/>
+      </w:pPr>
+      <w:r>
+        <w:rPr>
+          <w:rFonts w:ascii="Arial" w:cs="Arial" w:eastAsia="Arial" w:hAnsi="Arial"/>
+          <w:color w:val="2A4B7C"/>
+          <w:sz w:val="26"/>
+          <w:szCs w:val="26"/>
+          <w:rtl/>
+        </w:rPr>
+        <w:t xml:space="preserve">71. הנחתם שמודל הגיבוי האחרון לא צריך הרצה יומית. איך בדקתם את ההנחה?</w:t>
+      </w:r>
+    </w:p>
+    <w:p>
+      <w:pPr>
+        <w:bidi/>
+        <w:spacing w:after="160" w:line="300"/>
+        <w:jc w:val="right"/>
+      </w:pPr>
+      <w:r>
+        <w:rPr>
+          <w:rFonts w:ascii="Arial" w:cs="Arial" w:eastAsia="Arial" w:hAnsi="Arial"/>
+          <w:rtl/>
+        </w:rPr>
+        <w:t xml:space="preserve">B0 הוא הגיבוי האחרון בשרשרת, והוא לא מתאמן. הוא נשען רק על מחירים. לכן ההנחה הייתה שאפשר לבנות את מאגר השגיאות שלו מהמחירים שפורסמו, בלי להריץ אותו כל יום ברקע כמו את שאר הגיבויים.</w:t>
+      </w:r>
+    </w:p>
+    <w:p>
+      <w:pPr>
+        <w:bidi/>
+        <w:spacing w:after="160" w:line="300"/>
+        <w:jc w:val="right"/>
+      </w:pPr>
+      <w:r>
+        <w:rPr>
+          <w:rFonts w:ascii="Arial" w:cs="Arial" w:eastAsia="Arial" w:hAnsi="Arial"/>
+          <w:rtl/>
+        </w:rPr>
+        <w:t xml:space="preserve">לא סמכנו על ההנחה. השווינו את הבנייה מחדש מול המצב השמור של ההערכה המקורית, על כל לוח הזמנים. ב־2,390 ימים התוצאה זהה ביט לביט. אבל 36 ימים שההערכה המקורית מעולם לא קלטה, 26 ימים חלקיים אחרי מעבר שעון ו־10 ימים בלי נתונים, שינו את המאגר ב־524 נקודות זמן.</w:t>
+      </w:r>
+    </w:p>
+    <w:p>
+      <w:pPr>
+        <w:bidi/>
+        <w:spacing w:after="160" w:line="300"/>
+        <w:jc w:val="right"/>
+      </w:pPr>
+      <w:r>
+        <w:rPr>
+          <w:rFonts w:ascii="Arial" w:cs="Arial" w:eastAsia="Arial" w:hAnsi="Arial"/>
+          <w:b/>
+          <w:bCs/>
+          <w:rtl/>
+        </w:rPr>
+        <w:t xml:space="preserve">אז ההנחה נפלה, ו־B0 נכנס להרצות הרקע היומיות כמו שאר הגיבויים.</w:t>
+      </w:r>
+      <w:r>
+        <w:rPr>
+          <w:rFonts w:ascii="Arial" w:cs="Arial" w:eastAsia="Arial" w:hAnsi="Arial"/>
+          <w:rtl/>
+        </w:rPr>
+        <w:t xml:space="preserve"> זה עולה כחמש שניות ביום, והמאגר שלו נשאר זהה למה שנבדק.</w:t>
+      </w:r>
+    </w:p>
+    <w:p>
+      <w:pPr>
+        <w:pBdr>
+          <w:bottom w:val="single" w:sz="6" w:space="1" w:color="C8C8C8"/>
+        </w:pBdr>
+        <w:bidi/>
+        <w:spacing w:after="240" w:before="80"/>
+      </w:pPr>
+    </w:p>
+    <w:p>
+      <w:pPr>
+        <w:pStyle w:val="Heading2"/>
+        <w:bidi/>
+        <w:spacing w:after="160" w:before="360"/>
+        <w:jc w:val="right"/>
+      </w:pPr>
+      <w:r>
+        <w:rPr>
+          <w:rFonts w:ascii="Arial" w:cs="Arial" w:eastAsia="Arial" w:hAnsi="Arial"/>
+          <w:color w:val="2A4B7C"/>
+          <w:sz w:val="26"/>
+          <w:szCs w:val="26"/>
+          <w:rtl/>
+        </w:rPr>
+        <w:t xml:space="preserve">72. המודל מתאמן גם בדפדפן וגם בשרת. כמה הם מסכימים, ומה עשיתם כשהם לא הסכימו?</w:t>
+      </w:r>
+    </w:p>
+    <w:p>
+      <w:pPr>
+        <w:bidi/>
+        <w:spacing w:after="160" w:line="300"/>
+        <w:jc w:val="right"/>
+      </w:pPr>
+      <w:r>
+        <w:rPr>
+          <w:rFonts w:ascii="Arial" w:cs="Arial" w:eastAsia="Arial" w:hAnsi="Arial"/>
+          <w:rtl/>
+        </w:rPr>
+        <w:t xml:space="preserve">הקוד אחד, אבל האריתמטיקה של WebAssembly ושל ריצה מקומית לא זהה ברמת העיגול. קבענו סף של 0.01 אירו למגה־וואט־שעה. בהקפאה הראשונה ראינו פער של 0.028 ביום מעבר שעון, ויחסנו אותו לרשת אחת שהתאמנה עד תקרת 1,000 הסבבים.</w:t>
+      </w:r>
+    </w:p>
+    <w:p>
+      <w:pPr>
+        <w:bidi/>
+        <w:spacing w:after="160" w:line="300"/>
+        <w:jc w:val="right"/>
+      </w:pPr>
+      <w:r>
+        <w:rPr>
+          <w:rFonts w:ascii="Arial" w:cs="Arial" w:eastAsia="Arial" w:hAnsi="Arial"/>
+          <w:rtl/>
+        </w:rPr>
+        <w:t xml:space="preserve">בסבב ההקפאה השני ראינו 0.082 ביום אחר, מרשת שעצרה מוקדם, ב־351 סבבים. כלומר הסיבה היא לא התקרה, אלא אימון ארוך של רשת עמוקה שצובר הבדלי עיגול. לא כיווננו כלום כדי להעלים את זה.</w:t>
+      </w:r>
+    </w:p>
+    <w:p>
+      <w:pPr>
+        <w:bidi/>
+        <w:spacing w:after="160" w:line="300"/>
+        <w:jc w:val="right"/>
+      </w:pPr>
+      <w:r>
+        <w:rPr>
+          <w:rFonts w:ascii="Arial" w:cs="Arial" w:eastAsia="Arial" w:hAnsi="Arial"/>
+          <w:b/>
+          <w:bCs/>
+          <w:rtl/>
+        </w:rPr>
+        <w:t xml:space="preserve">הגדרנו בדיוק מה הסף אומר:</w:t>
+      </w:r>
+      <w:r>
+        <w:rPr>
+          <w:rFonts w:ascii="Arial" w:cs="Arial" w:eastAsia="Arial" w:hAnsi="Arial"/>
+          <w:rtl/>
+        </w:rPr>
+        <w:t xml:space="preserve"> הוא הסובלנות של מבקר שמאמן בעצמו בדפדפן, מול התחזית הרשמית, שמופקת באותו runtime ויוצאת זהה ביט לביט. ההשוואה מול ריצה מקומית נשארת בדיקת זהות הקוד, והמספר 0.082 מפורסם כפי שהוא.</w:t>
+      </w:r>
+    </w:p>
+    <w:p>
+      <w:pPr>
+        <w:pBdr>
+          <w:bottom w:val="single" w:sz="6" w:space="1" w:color="C8C8C8"/>
+        </w:pBdr>
+        <w:bidi/>
+        <w:spacing w:after="240" w:before="80"/>
+      </w:pPr>
+    </w:p>
+    <w:p>
+      <w:pPr>
+        <w:pStyle w:val="Heading2"/>
+        <w:bidi/>
+        <w:spacing w:after="160" w:before="360"/>
+        <w:jc w:val="right"/>
+      </w:pPr>
+      <w:r>
+        <w:rPr>
+          <w:rFonts w:ascii="Arial" w:cs="Arial" w:eastAsia="Arial" w:hAnsi="Arial"/>
+          <w:color w:val="2A4B7C"/>
+          <w:sz w:val="26"/>
+          <w:szCs w:val="26"/>
+          <w:rtl/>
+        </w:rPr>
+        <w:t xml:space="preserve">73. איך מוכיחים שהחבילה שרצה בייצור היא בדיוק החבילה שנבדקה?</w:t>
+      </w:r>
+    </w:p>
+    <w:p>
+      <w:pPr>
+        <w:bidi/>
+        <w:spacing w:after="160" w:line="300"/>
+        <w:jc w:val="right"/>
+      </w:pPr>
+      <w:r>
+        <w:rPr>
+          <w:rFonts w:ascii="Arial" w:cs="Arial" w:eastAsia="Arial" w:hAnsi="Arial"/>
+          <w:rtl/>
+        </w:rPr>
+        <w:t xml:space="preserve">אנחנו מזהים את החבילה לפי hash. גילינו שקובץ zip דטרמיניסטי לא תמיד יוצא באותם בייטים: הבייטים תלויים בגרסת zlib שדחסה אותו, כך שמכונה אחרת יכולה לייצר zip שונה מאותם קבצים בדיוק.</w:t>
+      </w:r>
+    </w:p>
+    <w:p>
+      <w:pPr>
+        <w:bidi/>
+        <w:spacing w:after="160" w:line="300"/>
+        <w:jc w:val="right"/>
+      </w:pPr>
+      <w:r>
+        <w:rPr>
+          <w:rFonts w:ascii="Arial" w:cs="Arial" w:eastAsia="Arial" w:hAnsi="Arial"/>
+          <w:b/>
+          <w:bCs/>
+          <w:rtl/>
+        </w:rPr>
+        <w:t xml:space="preserve">לכן המאמת משווה את ה־zip עצמו רק כשגרסת zlib תואמת, ותמיד משווה את הקבצים שבתוכו ואת זהות החבילה שמחושבת מהם.</w:t>
+      </w:r>
+      <w:r>
+        <w:rPr>
+          <w:rFonts w:ascii="Arial" w:cs="Arial" w:eastAsia="Arial" w:hAnsi="Arial"/>
+          <w:rtl/>
+        </w:rPr>
+        <w:t xml:space="preserve"> כך ה־hash מזהה את התוכן, לא את כלי הדחיסה.</w:t>
       </w:r>
     </w:p>
     <w:sectPr>

</xml_diff>